<commit_message>
feat: U9 Kudo Cards — fichas 1-3 en formato enriquecido + 3 diagramas verificados (reglas, box vs wall, fórmula)
</commit_message>
<xml_diff>
--- a/docx/03-modo-equipo/03-modo-equipo.docx
+++ b/docx/03-modo-equipo/03-modo-equipo.docx
@@ -550,7 +550,7 @@
     </w:p>
     <w:bookmarkEnd w:id="15"/>
     <w:bookmarkEnd w:id="16"/>
-    <w:bookmarkStart w:id="25" w:name="qué-es-el-compañerismo"/>
+    <w:bookmarkStart w:id="27" w:name="qué-es-el-compañerismo"/>
     <w:p>
       <w:pPr>
         <w:pStyle w:val="Heading1"/>
@@ -655,12 +655,164 @@
       </w:r>
     </w:p>
     <w:bookmarkEnd w:id="17"/>
-    <w:bookmarkStart w:id="18" w:name="X92b770843fd2ca1b5177adb1e08d10e9f741873"/>
+    <w:bookmarkStart w:id="18" w:name="X2d4ada710281e9aca51b59b96567885ce5729f1"/>
     <w:p>
       <w:pPr>
         <w:pStyle w:val="Heading2"/>
       </w:pPr>
       <w:r>
+        <w:t xml:space="preserve">💡 Por qué</w:t>
+      </w:r>
+      <w:r>
+        <w:t xml:space="preserve"> </w:t>
+      </w:r>
+      <w:r>
+        <w:t xml:space="preserve">“no dejar a nadie fuera”</w:t>
+      </w:r>
+      <w:r>
+        <w:t xml:space="preserve"> </w:t>
+      </w:r>
+      <w:r>
+        <w:t xml:space="preserve">es tan importante</w:t>
+      </w:r>
+    </w:p>
+    <w:p>
+      <w:pPr>
+        <w:pStyle w:val="FirstParagraph"/>
+      </w:pPr>
+      <w:r>
+        <w:t xml:space="preserve">Hay una verdad incómoda de la FPB: en el primer curso,</w:t>
+      </w:r>
+      <w:r>
+        <w:t xml:space="preserve"> </w:t>
+      </w:r>
+      <w:r>
+        <w:rPr>
+          <w:b/>
+          <w:bCs/>
+        </w:rPr>
+        <w:t xml:space="preserve">casi nadie se conoce</w:t>
+      </w:r>
+      <w:r>
+        <w:t xml:space="preserve">. Llegáis de sitios distintos, con amigos de infancia distintos y con los nervios de estar en una clase nueva. Y en ese momento, hay dos formas de que la clase acabe bien o mal — y</w:t>
+      </w:r>
+      <w:r>
+        <w:t xml:space="preserve"> </w:t>
+      </w:r>
+      <w:r>
+        <w:rPr>
+          <w:b/>
+          <w:bCs/>
+        </w:rPr>
+        <w:t xml:space="preserve">no depende de los profesores</w:t>
+      </w:r>
+      <w:r>
+        <w:t xml:space="preserve">: depende de los primeros 30 días.</w:t>
+      </w:r>
+    </w:p>
+    <w:p>
+      <w:pPr>
+        <w:pStyle w:val="BodyText"/>
+      </w:pPr>
+      <w:r>
+        <w:t xml:space="preserve">📌</w:t>
+      </w:r>
+      <w:r>
+        <w:t xml:space="preserve"> </w:t>
+      </w:r>
+      <w:r>
+        <w:rPr>
+          <w:b/>
+          <w:bCs/>
+        </w:rPr>
+        <w:t xml:space="preserve">Dato clave:</w:t>
+      </w:r>
+      <w:r>
+        <w:t xml:space="preserve"> </w:t>
+      </w:r>
+      <w:r>
+        <w:t xml:space="preserve">los grupos que funcionan no son los donde</w:t>
+      </w:r>
+      <w:r>
+        <w:t xml:space="preserve"> </w:t>
+      </w:r>
+      <w:r>
+        <w:t xml:space="preserve">“todo el mundo se cae bien”</w:t>
+      </w:r>
+      <w:r>
+        <w:t xml:space="preserve"> </w:t>
+      </w:r>
+      <w:r>
+        <w:t xml:space="preserve">(eso no existe). Son los donde</w:t>
+      </w:r>
+      <w:r>
+        <w:t xml:space="preserve"> </w:t>
+      </w:r>
+      <w:r>
+        <w:rPr>
+          <w:b/>
+          <w:bCs/>
+        </w:rPr>
+        <w:t xml:space="preserve">nadie se queda fuera</w:t>
+      </w:r>
+      <w:r>
+        <w:t xml:space="preserve">. Puedes no compartir nada con alguien y aun así darle sitio: eso es compañerismo. La amistad es otra cosa (y llega o no llega).</w:t>
+      </w:r>
+    </w:p>
+    <w:p>
+      <w:pPr>
+        <w:pStyle w:val="BlockText"/>
+      </w:pPr>
+      <w:r>
+        <w:t xml:space="preserve">💡</w:t>
+      </w:r>
+      <w:r>
+        <w:t xml:space="preserve"> </w:t>
+      </w:r>
+      <w:r>
+        <w:rPr>
+          <w:b/>
+          <w:bCs/>
+        </w:rPr>
+        <w:t xml:space="preserve">Analogía de la tienda:</w:t>
+      </w:r>
+      <w:r>
+        <w:t xml:space="preserve"> </w:t>
+      </w:r>
+      <w:r>
+        <w:t xml:space="preserve">“En mi tienda no se lleva bien todo el mundo — hay días que me tiran a los cascos. Pero cuando entra un cliente nuevo,</w:t>
+      </w:r>
+      <w:r>
+        <w:t xml:space="preserve"> </w:t>
+      </w:r>
+      <w:r>
+        <w:rPr>
+          <w:b/>
+          <w:bCs/>
+        </w:rPr>
+        <w:t xml:space="preserve">todos</w:t>
+      </w:r>
+      <w:r>
+        <w:t xml:space="preserve"> </w:t>
+      </w:r>
+      <w:r>
+        <w:t xml:space="preserve">atendemos. Eso no es amistad: es oficio. Y el aula es vuestro oficio ahora.”</w:t>
+      </w:r>
+    </w:p>
+    <w:p>
+      <w:r>
+        <w:pict>
+          <v:rect style="width:0;height:1.5pt" o:hralign="center" o:hrstd="t" o:hr="t"/>
+        </w:pict>
+      </w:r>
+    </w:p>
+    <w:bookmarkEnd w:id="18"/>
+    <w:bookmarkStart w:id="19" w:name="X92b770843fd2ca1b5177adb1e08d10e9f741873"/>
+    <w:p>
+      <w:pPr>
+        <w:pStyle w:val="Heading2"/>
+      </w:pPr>
+      <w:r>
         <w:t xml:space="preserve">🚪 El grupo que acoge y el grupo que expulsa</w:t>
       </w:r>
     </w:p>
@@ -670,6 +822,19 @@
       </w:pPr>
       <w:r>
         <w:t xml:space="preserve">Piensa en los dos grupos que existen en todo centro:</w:t>
+      </w:r>
+    </w:p>
+    <w:p>
+      <w:pPr>
+        <w:pStyle w:val="BodyText"/>
+      </w:pPr>
+    </w:p>
+    <w:p>
+      <w:pPr>
+        <w:pStyle w:val="BodyText"/>
+      </w:pPr>
+      <w:r>
+        <w:t xml:space="preserve">🚪 Los dos grupos — y el juego del chivo expiatorio que los separa</w:t>
       </w:r>
     </w:p>
     <w:tbl>
@@ -709,6 +874,12 @@
               </w:rPr>
               <w:t xml:space="preserve">Grupo que acoge</w:t>
             </w:r>
+            <w:r>
+              <w:t xml:space="preserve"> </w:t>
+            </w:r>
+            <w:r>
+              <w:t xml:space="preserve">🌱</w:t>
+            </w:r>
           </w:p>
         </w:tc>
         <w:tc>
@@ -724,6 +895,12 @@
               </w:rPr>
               <w:t xml:space="preserve">Grupo que expulsa</w:t>
             </w:r>
+            <w:r>
+              <w:t xml:space="preserve"> </w:t>
+            </w:r>
+            <w:r>
+              <w:t xml:space="preserve">🥀</w:t>
+            </w:r>
           </w:p>
         </w:tc>
       </w:tr>
@@ -875,6 +1052,10 @@
               <w:pStyle w:val="Compact"/>
             </w:pPr>
             <w:r>
+              <w:rPr>
+                <w:b/>
+                <w:bCs/>
+              </w:rPr>
               <w:t xml:space="preserve">Resultado</w:t>
             </w:r>
           </w:p>
@@ -931,8 +1112,8 @@
         </w:pict>
       </w:r>
     </w:p>
-    <w:bookmarkEnd w:id="18"/>
-    <w:bookmarkStart w:id="19" w:name="el-no-es-asunto-mío"/>
+    <w:bookmarkEnd w:id="19"/>
+    <w:bookmarkStart w:id="20" w:name="X2e506f9d64787d106b5e123041b8b0897f39547"/>
     <w:p>
       <w:pPr>
         <w:pStyle w:val="Heading2"/>
@@ -945,6 +1126,9 @@
       </w:r>
       <w:r>
         <w:t xml:space="preserve">“no es asunto mío”</w:t>
+      </w:r>
+      <w:r>
+        <w:t xml:space="preserve">: la frase que más daño hace</w:t>
       </w:r>
     </w:p>
     <w:p>
@@ -976,6 +1160,12 @@
         </w:numPr>
       </w:pPr>
       <w:r>
+        <w:t xml:space="preserve">👀</w:t>
+      </w:r>
+      <w:r>
+        <w:t xml:space="preserve"> </w:t>
+      </w:r>
+      <w:r>
         <w:rPr>
           <w:b/>
           <w:bCs/>
@@ -998,6 +1188,12 @@
         </w:numPr>
       </w:pPr>
       <w:r>
+        <w:t xml:space="preserve">🛡️</w:t>
+      </w:r>
+      <w:r>
+        <w:t xml:space="preserve"> </w:t>
+      </w:r>
+      <w:r>
         <w:rPr>
           <w:b/>
           <w:bCs/>
@@ -1029,10 +1225,7 @@
         <w:t xml:space="preserve">chivo expiatorio</w:t>
       </w:r>
       <w:r>
-        <w:t xml:space="preserve"> </w:t>
-      </w:r>
-      <w:r>
-        <w:t xml:space="preserve">— el grupo descarga sus tensiones sobre una persona, y mientras todos señalan al mismo,</w:t>
+        <w:t xml:space="preserve">. El grupo descarga sus tensiones sobre una persona, y mientras todos señalan al mismo,</w:t>
       </w:r>
       <w:r>
         <w:t xml:space="preserve"> </w:t>
@@ -1044,7 +1237,151 @@
         <w:t xml:space="preserve"> </w:t>
       </w:r>
       <w:r>
-        <w:t xml:space="preserve">queda unido a la mala. Unido de mentira, pero unido. Romper ese juego es cosa de varios, no de un héroe solitario.</w:t>
+        <w:t xml:space="preserve">queda unido a la mala.</w:t>
+      </w:r>
+      <w:r>
+        <w:t xml:space="preserve"> </w:t>
+      </w:r>
+      <w:r>
+        <w:rPr>
+          <w:b/>
+          <w:bCs/>
+        </w:rPr>
+        <w:t xml:space="preserve">Unido de mentira, pero unido.</w:t>
+      </w:r>
+      <w:r>
+        <w:t xml:space="preserve"> </w:t>
+      </w:r>
+      <w:r>
+        <w:t xml:space="preserve">Romper ese juego es cosa de varios, no de un héroe solitario.</w:t>
+      </w:r>
+    </w:p>
+    <w:p>
+      <w:pPr>
+        <w:pStyle w:val="BodyText"/>
+      </w:pPr>
+      <w:r>
+        <w:t xml:space="preserve">😬</w:t>
+      </w:r>
+      <w:r>
+        <w:t xml:space="preserve"> </w:t>
+      </w:r>
+      <w:r>
+        <w:rPr>
+          <w:b/>
+          <w:bCs/>
+        </w:rPr>
+        <w:t xml:space="preserve">Fail de DANI:</w:t>
+      </w:r>
+      <w:r>
+        <w:t xml:space="preserve"> </w:t>
+      </w:r>
+      <w:r>
+        <w:t xml:space="preserve">DANI pensó que</w:t>
+      </w:r>
+      <w:r>
+        <w:t xml:space="preserve"> </w:t>
+      </w:r>
+      <w:r>
+        <w:t xml:space="preserve">“no meterse”</w:t>
+      </w:r>
+      <w:r>
+        <w:t xml:space="preserve"> </w:t>
+      </w:r>
+      <w:r>
+        <w:t xml:space="preserve">era lo correcto: cuando al nuevo le bromeaban, él miraba a su cuaderno. Una semana después, ROSA le preguntó:</w:t>
+      </w:r>
+      <w:r>
+        <w:t xml:space="preserve"> </w:t>
+      </w:r>
+      <w:r>
+        <w:rPr>
+          <w:i/>
+          <w:iCs/>
+        </w:rPr>
+        <w:t xml:space="preserve">“¿Y tú por qué no dijiste nada?”</w:t>
+      </w:r>
+      <w:r>
+        <w:t xml:space="preserve">. DANI:</w:t>
+      </w:r>
+      <w:r>
+        <w:t xml:space="preserve"> </w:t>
+      </w:r>
+      <w:r>
+        <w:rPr>
+          <w:i/>
+          <w:iCs/>
+        </w:rPr>
+        <w:t xml:space="preserve">“Porque no era asunto mío”</w:t>
+      </w:r>
+      <w:r>
+        <w:t xml:space="preserve">. ROSA:</w:t>
+      </w:r>
+      <w:r>
+        <w:t xml:space="preserve"> </w:t>
+      </w:r>
+      <w:r>
+        <w:rPr>
+          <w:i/>
+          <w:iCs/>
+        </w:rPr>
+        <w:t xml:space="preserve">“Era asunto de todos. Tú solo elegiste no verlo.”</w:t>
+      </w:r>
+      <w:r>
+        <w:t xml:space="preserve"> </w:t>
+      </w:r>
+      <w:r>
+        <w:t xml:space="preserve">No hacer nada</w:t>
+      </w:r>
+      <w:r>
+        <w:t xml:space="preserve"> </w:t>
+      </w:r>
+      <w:r>
+        <w:rPr>
+          <w:b/>
+          <w:bCs/>
+        </w:rPr>
+        <w:t xml:space="preserve">también es una decisión</w:t>
+      </w:r>
+      <w:r>
+        <w:t xml:space="preserve"> </w:t>
+      </w:r>
+      <w:r>
+        <w:t xml:space="preserve">— y el grupo la siente.</w:t>
+      </w:r>
+    </w:p>
+    <w:p>
+      <w:pPr>
+        <w:pStyle w:val="BodyText"/>
+      </w:pPr>
+      <w:r>
+        <w:rPr>
+          <w:b/>
+          <w:bCs/>
+        </w:rPr>
+        <w:t xml:space="preserve">Y una línea clara:</w:t>
+      </w:r>
+      <w:r>
+        <w:t xml:space="preserve"> </w:t>
+      </w:r>
+      <w:r>
+        <w:t xml:space="preserve">apoyar no es enfrentarse solo. Si ves chivo expiatorio, no hace falta que encendes la luz tú a pecho descubierto:</w:t>
+      </w:r>
+      <w:r>
+        <w:t xml:space="preserve"> </w:t>
+      </w:r>
+      <w:r>
+        <w:rPr>
+          <w:b/>
+          <w:bCs/>
+        </w:rPr>
+        <w:t xml:space="preserve">avisar</w:t>
+      </w:r>
+      <w:r>
+        <w:t xml:space="preserve"> </w:t>
+      </w:r>
+      <w:r>
+        <w:t xml:space="preserve">(a la docencia, en privado, por mensaje) ya es cortar el juego. Nadie te pide ser héroe: te pide no ser cómplice.</w:t>
       </w:r>
     </w:p>
     <w:p>
@@ -1054,8 +1391,8 @@
         </w:pict>
       </w:r>
     </w:p>
-    <w:bookmarkEnd w:id="19"/>
-    <w:bookmarkStart w:id="20" w:name="el-compañerismo-cotidiano-no-de-película"/>
+    <w:bookmarkEnd w:id="20"/>
+    <w:bookmarkStart w:id="21" w:name="el-compañerismo-cotidiano-no-de-película"/>
     <w:p>
       <w:pPr>
         <w:pStyle w:val="Heading2"/>
@@ -1081,7 +1418,23 @@
         </w:numPr>
       </w:pPr>
       <w:r>
-        <w:t xml:space="preserve">Saludar a quien entra, aunque no seas su amigo.</w:t>
+        <w:t xml:space="preserve">👋</w:t>
+      </w:r>
+      <w:r>
+        <w:t xml:space="preserve"> </w:t>
+      </w:r>
+      <w:r>
+        <w:rPr>
+          <w:b/>
+          <w:bCs/>
+        </w:rPr>
+        <w:t xml:space="preserve">Saludar</w:t>
+      </w:r>
+      <w:r>
+        <w:t xml:space="preserve"> </w:t>
+      </w:r>
+      <w:r>
+        <w:t xml:space="preserve">a quien entra, aunque no seas su amigo.</w:t>
       </w:r>
     </w:p>
     <w:p>
@@ -1093,12 +1446,26 @@
         </w:numPr>
       </w:pPr>
       <w:r>
+        <w:t xml:space="preserve">🚪</w:t>
+      </w:r>
+      <w:r>
+        <w:t xml:space="preserve"> </w:t>
+      </w:r>
+      <w:r>
+        <w:rPr>
+          <w:b/>
+          <w:bCs/>
+        </w:rPr>
         <w:t xml:space="preserve">Preguntar al que está solo:</w:t>
       </w:r>
       <w:r>
         <w:t xml:space="preserve"> </w:t>
       </w:r>
       <w:r>
+        <w:rPr>
+          <w:i/>
+          <w:iCs/>
+        </w:rPr>
         <w:t xml:space="preserve">“¿te apetece venir?”</w:t>
       </w:r>
       <w:r>
@@ -1117,7 +1484,23 @@
         </w:numPr>
       </w:pPr>
       <w:r>
-        <w:t xml:space="preserve">Compartir apuntes sin que te lo roguen.</w:t>
+        <w:t xml:space="preserve">📄</w:t>
+      </w:r>
+      <w:r>
+        <w:t xml:space="preserve"> </w:t>
+      </w:r>
+      <w:r>
+        <w:rPr>
+          <w:b/>
+          <w:bCs/>
+        </w:rPr>
+        <w:t xml:space="preserve">Compartir apuntes</w:t>
+      </w:r>
+      <w:r>
+        <w:t xml:space="preserve"> </w:t>
+      </w:r>
+      <w:r>
+        <w:t xml:space="preserve">sin que te lo roguen.</w:t>
       </w:r>
     </w:p>
     <w:p>
@@ -1129,12 +1512,32 @@
         </w:numPr>
       </w:pPr>
       <w:r>
-        <w:t xml:space="preserve">No alimentar la burla: si el grupo se ríe, no sumarte. Callarse ya es algo; decir</w:t>
-      </w:r>
-      <w:r>
-        <w:t xml:space="preserve"> </w:t>
-      </w:r>
-      <w:r>
+        <w:t xml:space="preserve">🛑</w:t>
+      </w:r>
+      <w:r>
+        <w:t xml:space="preserve"> </w:t>
+      </w:r>
+      <w:r>
+        <w:rPr>
+          <w:b/>
+          <w:bCs/>
+        </w:rPr>
+        <w:t xml:space="preserve">No alimentar la burla:</w:t>
+      </w:r>
+      <w:r>
+        <w:t xml:space="preserve"> </w:t>
+      </w:r>
+      <w:r>
+        <w:t xml:space="preserve">si el grupo se ríe, no sumarte. Callarse ya es algo; decir</w:t>
+      </w:r>
+      <w:r>
+        <w:t xml:space="preserve"> </w:t>
+      </w:r>
+      <w:r>
+        <w:rPr>
+          <w:i/>
+          <w:iCs/>
+        </w:rPr>
         <w:t xml:space="preserve">“no es para tanto”</w:t>
       </w:r>
       <w:r>
@@ -1165,7 +1568,20 @@
         <w:t xml:space="preserve"> </w:t>
       </w:r>
       <w:r>
-        <w:t xml:space="preserve">“En la tienda, el que ayuda al nuevo a la semana ya es veterano. En clase funciona igual: el que da sitio, manda.”</w:t>
+        <w:t xml:space="preserve">“En la tienda, el que ayuda al nuevo a la semana ya es veterano. En clase funciona igual:</w:t>
+      </w:r>
+      <w:r>
+        <w:t xml:space="preserve"> </w:t>
+      </w:r>
+      <w:r>
+        <w:rPr>
+          <w:b/>
+          <w:bCs/>
+        </w:rPr>
+        <w:t xml:space="preserve">el que da sitio, manda</w:t>
+      </w:r>
+      <w:r>
+        <w:t xml:space="preserve">.”</w:t>
       </w:r>
     </w:p>
     <w:p>
@@ -1175,14 +1591,519 @@
         </w:pict>
       </w:r>
     </w:p>
-    <w:bookmarkEnd w:id="20"/>
-    <w:bookmarkStart w:id="21" w:name="mini-chequeo"/>
+    <w:p>
+      <w:pPr>
+        <w:pStyle w:val="FirstParagraph"/>
+      </w:pPr>
+      <w:r>
+        <w:t xml:space="preserve">👤 Nombre:</w:t>
+      </w:r>
+      <w:r>
+        <w:t xml:space="preserve"> </w:t>
+      </w:r>
+      <w:r>
+        <w:t xml:space="preserve">📅 Fecha:</w:t>
+      </w:r>
+      <w:r>
+        <w:t xml:space="preserve"> </w:t>
+      </w:r>
+      <w:r>
+        <w:t xml:space="preserve">🏫 Grupo:</w:t>
+      </w:r>
+    </w:p>
+    <w:bookmarkEnd w:id="21"/>
+    <w:bookmarkStart w:id="22" w:name="a-por-ellos"/>
     <w:p>
       <w:pPr>
         <w:pStyle w:val="Heading2"/>
       </w:pPr>
       <w:r>
-        <w:t xml:space="preserve">🧠 Mini-chequeo</w:t>
+        <w:t xml:space="preserve">✍️ A por ellos</w:t>
+      </w:r>
+    </w:p>
+    <w:p>
+      <w:pPr>
+        <w:pStyle w:val="FirstParagraph"/>
+      </w:pPr>
+      <w:r>
+        <w:rPr>
+          <w:b/>
+          <w:bCs/>
+        </w:rPr>
+        <w:t xml:space="preserve">1. ✏️ Completa:</w:t>
+      </w:r>
+    </w:p>
+    <w:p>
+      <w:pPr>
+        <w:pStyle w:val="BlockText"/>
+      </w:pPr>
+      <w:r>
+        <w:t xml:space="preserve">El compañerismo no es ______: es no ______ a nadie fuera, especialmente a quien tiene más ______ entrar.</w:t>
+      </w:r>
+    </w:p>
+    <w:p>
+      <w:pPr>
+        <w:pStyle w:val="FirstParagraph"/>
+      </w:pPr>
+      <w:r>
+        <w:rPr>
+          <w:b/>
+          <w:bCs/>
+        </w:rPr>
+        <w:t xml:space="preserve">2. 🎯 Acoge o expulsa:</w:t>
+      </w:r>
+      <w:r>
+        <w:t xml:space="preserve"> </w:t>
+      </w:r>
+      <w:r>
+        <w:t xml:space="preserve">en cada caso, marca</w:t>
+      </w:r>
+      <w:r>
+        <w:t xml:space="preserve"> </w:t>
+      </w:r>
+      <w:r>
+        <w:rPr>
+          <w:b/>
+          <w:bCs/>
+        </w:rPr>
+        <w:t xml:space="preserve">A</w:t>
+      </w:r>
+      <w:r>
+        <w:t xml:space="preserve"> </w:t>
+      </w:r>
+      <w:r>
+        <w:t xml:space="preserve">(acoge) o</w:t>
+      </w:r>
+      <w:r>
+        <w:t xml:space="preserve"> </w:t>
+      </w:r>
+      <w:r>
+        <w:rPr>
+          <w:b/>
+          <w:bCs/>
+        </w:rPr>
+        <w:t xml:space="preserve">E</w:t>
+      </w:r>
+      <w:r>
+        <w:t xml:space="preserve"> </w:t>
+      </w:r>
+      <w:r>
+        <w:t xml:space="preserve">(expulsa):</w:t>
+      </w:r>
+    </w:p>
+    <w:tbl>
+      <w:tblPr>
+        <w:tblStyle w:val="Table"/>
+        <w:tblW w:type="auto" w:w="0"/>
+        <w:tblLook w:firstRow="1" w:lastRow="0" w:firstColumn="0" w:lastColumn="0" w:noHBand="0" w:noVBand="0" w:val="0020"/>
+      </w:tblPr>
+      <w:tblGrid>
+        <w:gridCol w:w="3960"/>
+        <w:gridCol w:w="3960"/>
+      </w:tblGrid>
+      <w:tr>
+        <w:trPr>
+          <w:tblHeader w:val="on"/>
+        </w:trPr>
+        <w:tc>
+          <w:tcPr/>
+          <w:p>
+            <w:pPr>
+              <w:pStyle w:val="Compact"/>
+            </w:pPr>
+            <w:r>
+              <w:t xml:space="preserve">Caso</w:t>
+            </w:r>
+          </w:p>
+        </w:tc>
+        <w:tc>
+          <w:tcPr/>
+          <w:p>
+            <w:pPr>
+              <w:pStyle w:val="Compact"/>
+            </w:pPr>
+            <w:r>
+              <w:t xml:space="preserve">A/E</w:t>
+            </w:r>
+          </w:p>
+        </w:tc>
+      </w:tr>
+      <w:tr>
+        <w:tc>
+          <w:tcPr/>
+          <w:p>
+            <w:pPr>
+              <w:pStyle w:val="Compact"/>
+            </w:pPr>
+            <w:r>
+              <w:t xml:space="preserve">“Venid, aquí hay sitio”</w:t>
+            </w:r>
+            <w:r>
+              <w:t xml:space="preserve"> </w:t>
+            </w:r>
+            <w:r>
+              <w:t xml:space="preserve">al que llega tarde</w:t>
+            </w:r>
+          </w:p>
+        </w:tc>
+        <w:tc>
+          <w:tcPr/>
+          <w:p>
+            <w:pPr>
+              <w:pStyle w:val="Compact"/>
+            </w:pPr>
+          </w:p>
+        </w:tc>
+      </w:tr>
+      <w:tr>
+        <w:tc>
+          <w:tcPr/>
+          <w:p>
+            <w:pPr>
+              <w:pStyle w:val="Compact"/>
+            </w:pPr>
+            <w:r>
+              <w:t xml:space="preserve">Reírse del error del nuevo delante de todos</w:t>
+            </w:r>
+          </w:p>
+        </w:tc>
+        <w:tc>
+          <w:tcPr/>
+          <w:p>
+            <w:pPr>
+              <w:pStyle w:val="Compact"/>
+            </w:pPr>
+          </w:p>
+        </w:tc>
+      </w:tr>
+      <w:tr>
+        <w:tc>
+          <w:tcPr/>
+          <w:p>
+            <w:pPr>
+              <w:pStyle w:val="Compact"/>
+            </w:pPr>
+            <w:r>
+              <w:t xml:space="preserve">Compartir los apuntes sin que lo pidan</w:t>
+            </w:r>
+          </w:p>
+        </w:tc>
+        <w:tc>
+          <w:tcPr/>
+          <w:p>
+            <w:pPr>
+              <w:pStyle w:val="Compact"/>
+            </w:pPr>
+          </w:p>
+        </w:tc>
+      </w:tr>
+      <w:tr>
+        <w:tc>
+          <w:tcPr/>
+          <w:p>
+            <w:pPr>
+              <w:pStyle w:val="Compact"/>
+            </w:pPr>
+            <w:r>
+              <w:t xml:space="preserve">“Yo no quiero de compañero con él”</w:t>
+            </w:r>
+          </w:p>
+        </w:tc>
+        <w:tc>
+          <w:tcPr/>
+          <w:p>
+            <w:pPr>
+              <w:pStyle w:val="Compact"/>
+            </w:pPr>
+          </w:p>
+        </w:tc>
+      </w:tr>
+      <w:tr>
+        <w:tc>
+          <w:tcPr/>
+          <w:p>
+            <w:pPr>
+              <w:pStyle w:val="Compact"/>
+            </w:pPr>
+            <w:r>
+              <w:t xml:space="preserve">Preguntar al que está solo si viene al recreo</w:t>
+            </w:r>
+          </w:p>
+        </w:tc>
+        <w:tc>
+          <w:tcPr/>
+          <w:p>
+            <w:pPr>
+              <w:pStyle w:val="Compact"/>
+            </w:pPr>
+          </w:p>
+        </w:tc>
+      </w:tr>
+    </w:tbl>
+    <w:p>
+      <w:pPr>
+        <w:pStyle w:val="BodyText"/>
+      </w:pPr>
+      <w:r>
+        <w:rPr>
+          <w:b/>
+          <w:bCs/>
+        </w:rPr>
+        <w:t xml:space="preserve">3. 🤐 El asunto mío:</w:t>
+      </w:r>
+      <w:r>
+        <w:t xml:space="preserve"> </w:t>
+      </w:r>
+      <w:r>
+        <w:t xml:space="preserve">reescribe la frase</w:t>
+      </w:r>
+      <w:r>
+        <w:t xml:space="preserve"> </w:t>
+      </w:r>
+      <w:r>
+        <w:rPr>
+          <w:i/>
+          <w:iCs/>
+        </w:rPr>
+        <w:t xml:space="preserve">“no es asunto mío”</w:t>
+      </w:r>
+      <w:r>
+        <w:t xml:space="preserve"> </w:t>
+      </w:r>
+      <w:r>
+        <w:t xml:space="preserve">como</w:t>
+      </w:r>
+      <w:r>
+        <w:t xml:space="preserve"> </w:t>
+      </w:r>
+      <w:r>
+        <w:rPr>
+          <w:b/>
+          <w:bCs/>
+        </w:rPr>
+        <w:t xml:space="preserve">una acción concreta</w:t>
+      </w:r>
+      <w:r>
+        <w:t xml:space="preserve"> </w:t>
+      </w:r>
+      <w:r>
+        <w:t xml:space="preserve">que harías tú:</w:t>
+      </w:r>
+    </w:p>
+    <w:p>
+      <w:pPr>
+        <w:pStyle w:val="BlockText"/>
+      </w:pPr>
+      <w:r>
+        <w:t xml:space="preserve"> </w:t>
+      </w:r>
+    </w:p>
+    <w:p>
+      <w:pPr>
+        <w:pStyle w:val="FirstParagraph"/>
+      </w:pPr>
+      <w:r>
+        <w:rPr>
+          <w:b/>
+          <w:bCs/>
+        </w:rPr>
+        <w:t xml:space="preserve">4. ⚠️ Detecta el chivo expiatorio:</w:t>
+      </w:r>
+      <w:r>
+        <w:t xml:space="preserve"> </w:t>
+      </w:r>
+      <w:r>
+        <w:t xml:space="preserve">en la clase, el grupo se burla cada semana del mismo compañero. Escribe</w:t>
+      </w:r>
+      <w:r>
+        <w:t xml:space="preserve"> </w:t>
+      </w:r>
+      <w:r>
+        <w:rPr>
+          <w:b/>
+          <w:bCs/>
+        </w:rPr>
+        <w:t xml:space="preserve">las dos vías</w:t>
+      </w:r>
+      <w:r>
+        <w:t xml:space="preserve"> </w:t>
+      </w:r>
+      <w:r>
+        <w:t xml:space="preserve">para cortarlo (una directa y una de aviso):</w:t>
+      </w:r>
+    </w:p>
+    <w:p>
+      <w:pPr>
+        <w:pStyle w:val="BlockText"/>
+      </w:pPr>
+      <w:r>
+        <w:t xml:space="preserve">Directa:</w:t>
+      </w:r>
+      <w:r>
+        <w:t xml:space="preserve"> </w:t>
+      </w:r>
+      <w:r>
+        <w:t xml:space="preserve"> </w:t>
+      </w:r>
+      <w:r>
+        <w:t xml:space="preserve">Aviso:</w:t>
+      </w:r>
+      <w:r>
+        <w:t xml:space="preserve"> </w:t>
+      </w:r>
+    </w:p>
+    <w:p>
+      <w:pPr>
+        <w:pStyle w:val="FirstParagraph"/>
+      </w:pPr>
+      <w:r>
+        <w:rPr>
+          <w:b/>
+          <w:bCs/>
+        </w:rPr>
+        <w:t xml:space="preserve">5. 🧩 Tu gesto de acoger:</w:t>
+      </w:r>
+      <w:r>
+        <w:t xml:space="preserve"> </w:t>
+      </w:r>
+      <w:r>
+        <w:t xml:space="preserve">elige UNO de los gestos cotidianos (saludar, invitar, compartir, no sumarte a la burla) y pon día exacto para hacerlo:</w:t>
+      </w:r>
+    </w:p>
+    <w:p>
+      <w:pPr>
+        <w:pStyle w:val="BlockText"/>
+      </w:pPr>
+      <w:r>
+        <w:t xml:space="preserve">Mi gesto:</w:t>
+      </w:r>
+      <w:r>
+        <w:t xml:space="preserve"> </w:t>
+      </w:r>
+      <w:r>
+        <w:t xml:space="preserve"> </w:t>
+      </w:r>
+      <w:r>
+        <w:t xml:space="preserve">Día: ______ de ____________</w:t>
+      </w:r>
+    </w:p>
+    <w:p>
+      <w:r>
+        <w:pict>
+          <v:rect style="width:0;height:1.5pt" o:hralign="center" o:hrstd="t" o:hr="t"/>
+        </w:pict>
+      </w:r>
+    </w:p>
+    <w:bookmarkEnd w:id="22"/>
+    <w:bookmarkStart w:id="23" w:name="mini-dinámica-la-mesa-del-recreo-5-min"/>
+    <w:p>
+      <w:pPr>
+        <w:pStyle w:val="Heading2"/>
+      </w:pPr>
+      <w:r>
+        <w:t xml:space="preserve">🎭 Mini dinámica: La mesa del recreo 👥 5 min</w:t>
+      </w:r>
+    </w:p>
+    <w:p>
+      <w:pPr>
+        <w:pStyle w:val="FirstParagraph"/>
+      </w:pPr>
+      <w:r>
+        <w:t xml:space="preserve">Cada uno escribe en un post-it</w:t>
+      </w:r>
+      <w:r>
+        <w:t xml:space="preserve"> </w:t>
+      </w:r>
+      <w:r>
+        <w:rPr>
+          <w:b/>
+          <w:bCs/>
+        </w:rPr>
+        <w:t xml:space="preserve">un sitio donde siempre se queda solo</w:t>
+      </w:r>
+      <w:r>
+        <w:t xml:space="preserve"> </w:t>
+      </w:r>
+      <w:r>
+        <w:t xml:space="preserve">(una mesa, una esquina, el último banco…). Se dobla y se sortean: tu misión esta semana es</w:t>
+      </w:r>
+      <w:r>
+        <w:t xml:space="preserve"> </w:t>
+      </w:r>
+      <w:r>
+        <w:rPr>
+          <w:b/>
+          <w:bCs/>
+        </w:rPr>
+        <w:t xml:space="preserve">invitar a alguien a ese sitio</w:t>
+      </w:r>
+      <w:r>
+        <w:t xml:space="preserve"> </w:t>
+      </w:r>
+      <w:r>
+        <w:t xml:space="preserve">— aunque no seas su amigo. Nadie dice de quién es el post-it.</w:t>
+      </w:r>
+    </w:p>
+    <w:p>
+      <w:pPr>
+        <w:pStyle w:val="BlockText"/>
+      </w:pPr>
+      <w:r>
+        <w:t xml:space="preserve">♿</w:t>
+      </w:r>
+      <w:r>
+        <w:t xml:space="preserve"> </w:t>
+      </w:r>
+      <w:r>
+        <w:rPr>
+          <w:b/>
+          <w:bCs/>
+        </w:rPr>
+        <w:t xml:space="preserve">Inclusión:</w:t>
+      </w:r>
+      <w:r>
+        <w:t xml:space="preserve"> </w:t>
+      </w:r>
+      <w:r>
+        <w:t xml:space="preserve">el sorteo evita que solo inviten a los amigos. La docencia vigila que todos tengan post-it y que la misión sea</w:t>
+      </w:r>
+      <w:r>
+        <w:t xml:space="preserve"> </w:t>
+      </w:r>
+      <w:r>
+        <w:rPr>
+          <w:b/>
+          <w:bCs/>
+        </w:rPr>
+        <w:t xml:space="preserve">un gesto</w:t>
+      </w:r>
+      <w:r>
+        <w:t xml:space="preserve">, no una amistad forzada.</w:t>
+      </w:r>
+    </w:p>
+    <w:p>
+      <w:r>
+        <w:pict>
+          <v:rect style="width:0;height:1.5pt" o:hralign="center" o:hrstd="t" o:hr="t"/>
+        </w:pict>
+      </w:r>
+    </w:p>
+    <w:bookmarkEnd w:id="23"/>
+    <w:bookmarkStart w:id="24" w:name="soluciones-y-pistas"/>
+    <w:p>
+      <w:pPr>
+        <w:pStyle w:val="Heading2"/>
+      </w:pPr>
+      <w:r>
+        <w:t xml:space="preserve">🔑 Soluciones y pistas</w:t>
+      </w:r>
+    </w:p>
+    <w:p>
+      <w:pPr>
+        <w:pStyle w:val="FirstParagraph"/>
+      </w:pPr>
+      <w:r>
+        <w:t xml:space="preserve">🔄 Ver soluciones</w:t>
       </w:r>
     </w:p>
     <w:p>
@@ -1194,7 +2115,11 @@
         </w:numPr>
       </w:pPr>
       <w:r>
-        <w:t xml:space="preserve">Nombra tres diferencias entre un grupo que acoge y uno que expulsa.</w:t>
+        <w:rPr>
+          <w:b/>
+          <w:bCs/>
+        </w:rPr>
+        <w:t xml:space="preserve">amistad, dejar, difícil.</w:t>
       </w:r>
     </w:p>
     <w:p>
@@ -1206,19 +2131,7 @@
         </w:numPr>
       </w:pPr>
       <w:r>
-        <w:t xml:space="preserve">¿Por qué</w:t>
-      </w:r>
-      <w:r>
-        <w:t xml:space="preserve"> </w:t>
-      </w:r>
-      <w:r>
-        <w:t xml:space="preserve">“no es asunto mío”</w:t>
-      </w:r>
-      <w:r>
-        <w:t xml:space="preserve"> </w:t>
-      </w:r>
-      <w:r>
-        <w:t xml:space="preserve">es la frase que más daño hace?</w:t>
+        <w:t xml:space="preserve">A · E · A · E · A.</w:t>
       </w:r>
     </w:p>
     <w:p>
@@ -1230,7 +2143,67 @@
         </w:numPr>
       </w:pPr>
       <w:r>
-        <w:t xml:space="preserve">¿Qué es el chivo expiatorio y cómo beneficia (falsamente) al grupo?</w:t>
+        <w:t xml:space="preserve">Ejemplos:</w:t>
+      </w:r>
+      <w:r>
+        <w:t xml:space="preserve"> </w:t>
+      </w:r>
+      <w:r>
+        <w:t xml:space="preserve">“Voy a preguntarle qué le pasa”</w:t>
+      </w:r>
+      <w:r>
+        <w:t xml:space="preserve">,</w:t>
+      </w:r>
+      <w:r>
+        <w:t xml:space="preserve"> </w:t>
+      </w:r>
+      <w:r>
+        <w:t xml:space="preserve">“Le aviso a la profe”</w:t>
+      </w:r>
+      <w:r>
+        <w:t xml:space="preserve">,</w:t>
+      </w:r>
+      <w:r>
+        <w:t xml:space="preserve"> </w:t>
+      </w:r>
+      <w:r>
+        <w:t xml:space="preserve">“Me siento con él hoy”</w:t>
+      </w:r>
+      <w:r>
+        <w:t xml:space="preserve">.</w:t>
+      </w:r>
+    </w:p>
+    <w:p>
+      <w:pPr>
+        <w:pStyle w:val="Compact"/>
+        <w:numPr>
+          <w:ilvl w:val="0"/>
+          <w:numId w:val="1005"/>
+        </w:numPr>
+      </w:pPr>
+      <w:r>
+        <w:t xml:space="preserve">Directa:</w:t>
+      </w:r>
+      <w:r>
+        <w:t xml:space="preserve"> </w:t>
+      </w:r>
+      <w:r>
+        <w:t xml:space="preserve">“Eh, dejadlo, que no es para tanto”</w:t>
+      </w:r>
+      <w:r>
+        <w:t xml:space="preserve">. Aviso: escribir a la docencia o decírselo en privado. Pista: ambas valen; no hace falta hacer las dos.</w:t>
+      </w:r>
+    </w:p>
+    <w:p>
+      <w:pPr>
+        <w:pStyle w:val="Compact"/>
+        <w:numPr>
+          <w:ilvl w:val="0"/>
+          <w:numId w:val="1005"/>
+        </w:numPr>
+      </w:pPr>
+      <w:r>
+        <w:t xml:space="preserve">Cada cual suyo.</w:t>
       </w:r>
     </w:p>
     <w:p>
@@ -1240,14 +2213,14 @@
         </w:pict>
       </w:r>
     </w:p>
-    <w:bookmarkEnd w:id="21"/>
-    <w:bookmarkStart w:id="22" w:name="resumen-en-3-frases"/>
+    <w:bookmarkEnd w:id="24"/>
+    <w:bookmarkStart w:id="26" w:name="vocabulario-rápido"/>
     <w:p>
       <w:pPr>
         <w:pStyle w:val="Heading2"/>
       </w:pPr>
       <w:r>
-        <w:t xml:space="preserve">✅ Resumen en 3 frases</w:t>
+        <w:t xml:space="preserve">📛 Vocabulario rápido</w:t>
       </w:r>
     </w:p>
     <w:p>
@@ -1259,7 +2232,17 @@
         </w:numPr>
       </w:pPr>
       <w:r>
-        <w:t xml:space="preserve">Compañerismo no es amistad: es no dejar a nadie fuera, especialmente a quien cuesta más entrar.</w:t>
+        <w:rPr>
+          <w:b/>
+          <w:bCs/>
+        </w:rPr>
+        <w:t xml:space="preserve">Compañerismo:</w:t>
+      </w:r>
+      <w:r>
+        <w:t xml:space="preserve"> </w:t>
+      </w:r>
+      <w:r>
+        <w:t xml:space="preserve">consideración y ayuda entre personas que comparten grupo o actividad.</w:t>
       </w:r>
     </w:p>
     <w:p>
@@ -1271,19 +2254,17 @@
         </w:numPr>
       </w:pPr>
       <w:r>
-        <w:t xml:space="preserve">El</w:t>
-      </w:r>
-      <w:r>
-        <w:t xml:space="preserve"> </w:t>
-      </w:r>
-      <w:r>
-        <w:t xml:space="preserve">“no es asunto mío”</w:t>
-      </w:r>
-      <w:r>
-        <w:t xml:space="preserve"> </w:t>
-      </w:r>
-      <w:r>
-        <w:t xml:space="preserve">alimenta los conflictos; apoyar y avisar los corta pronto.</w:t>
+        <w:rPr>
+          <w:b/>
+          <w:bCs/>
+        </w:rPr>
+        <w:t xml:space="preserve">Chivo expiatorio:</w:t>
+      </w:r>
+      <w:r>
+        <w:t xml:space="preserve"> </w:t>
+      </w:r>
+      <w:r>
+        <w:t xml:space="preserve">persona sobre la que un grupo descarga tensiones y conflictos.</w:t>
       </w:r>
     </w:p>
     <w:p>
@@ -1295,7 +2276,17 @@
         </w:numPr>
       </w:pPr>
       <w:r>
-        <w:t xml:space="preserve">El chivo expiatorio une al grupo de mentira; romperlo es cosa de varios.</w:t>
+        <w:rPr>
+          <w:b/>
+          <w:bCs/>
+        </w:rPr>
+        <w:t xml:space="preserve">Exclusión social:</w:t>
+      </w:r>
+      <w:r>
+        <w:t xml:space="preserve"> </w:t>
+      </w:r>
+      <w:r>
+        <w:t xml:space="preserve">dejar a alguien sistemáticamente fuera de las interacciones del grupo.</w:t>
       </w:r>
     </w:p>
     <w:p>
@@ -1305,89 +2296,6 @@
         </w:pict>
       </w:r>
     </w:p>
-    <w:bookmarkEnd w:id="22"/>
-    <w:bookmarkStart w:id="24" w:name="vocabulario-rápido"/>
-    <w:p>
-      <w:pPr>
-        <w:pStyle w:val="Heading2"/>
-      </w:pPr>
-      <w:r>
-        <w:t xml:space="preserve">🐛 Vocabulario rápido</w:t>
-      </w:r>
-    </w:p>
-    <w:p>
-      <w:pPr>
-        <w:pStyle w:val="Compact"/>
-        <w:numPr>
-          <w:ilvl w:val="0"/>
-          <w:numId w:val="1007"/>
-        </w:numPr>
-      </w:pPr>
-      <w:r>
-        <w:rPr>
-          <w:b/>
-          <w:bCs/>
-        </w:rPr>
-        <w:t xml:space="preserve">Compañerismo:</w:t>
-      </w:r>
-      <w:r>
-        <w:t xml:space="preserve"> </w:t>
-      </w:r>
-      <w:r>
-        <w:t xml:space="preserve">consideración y ayuda entre personas que comparten grupo o actividad.</w:t>
-      </w:r>
-    </w:p>
-    <w:p>
-      <w:pPr>
-        <w:pStyle w:val="Compact"/>
-        <w:numPr>
-          <w:ilvl w:val="0"/>
-          <w:numId w:val="1007"/>
-        </w:numPr>
-      </w:pPr>
-      <w:r>
-        <w:rPr>
-          <w:b/>
-          <w:bCs/>
-        </w:rPr>
-        <w:t xml:space="preserve">Chivo expiatorio:</w:t>
-      </w:r>
-      <w:r>
-        <w:t xml:space="preserve"> </w:t>
-      </w:r>
-      <w:r>
-        <w:t xml:space="preserve">persona sobre la que un grupo descarga tensiones y conflictos.</w:t>
-      </w:r>
-    </w:p>
-    <w:p>
-      <w:pPr>
-        <w:pStyle w:val="Compact"/>
-        <w:numPr>
-          <w:ilvl w:val="0"/>
-          <w:numId w:val="1007"/>
-        </w:numPr>
-      </w:pPr>
-      <w:r>
-        <w:rPr>
-          <w:b/>
-          <w:bCs/>
-        </w:rPr>
-        <w:t xml:space="preserve">Exclusión social:</w:t>
-      </w:r>
-      <w:r>
-        <w:t xml:space="preserve"> </w:t>
-      </w:r>
-      <w:r>
-        <w:t xml:space="preserve">dejar a alguien sistemáticamente fuera de las interacciones del grupo.</w:t>
-      </w:r>
-    </w:p>
-    <w:p>
-      <w:r>
-        <w:pict>
-          <v:rect style="width:0;height:1.5pt" o:hralign="center" o:hrstd="t" o:hr="t"/>
-        </w:pict>
-      </w:r>
-    </w:p>
     <w:p>
       <w:pPr>
         <w:pStyle w:val="FirstParagraph"/>
@@ -1398,7 +2306,7 @@
       <w:r>
         <w:t xml:space="preserve"> </w:t>
       </w:r>
-      <w:hyperlink r:id="rId23">
+      <w:hyperlink r:id="rId25">
         <w:r>
           <w:rPr>
             <w:rStyle w:val="Hyperlink"/>
@@ -1425,7 +2333,7 @@
       <w:r>
         <w:t xml:space="preserve"> </w:t>
       </w:r>
-      <w:hyperlink r:id="rId23">
+      <w:hyperlink r:id="rId25">
         <w:r>
           <w:rPr>
             <w:rStyle w:val="Hyperlink"/>
@@ -1461,9 +2369,9 @@
         </w:r>
       </w:hyperlink>
     </w:p>
-    <w:bookmarkEnd w:id="24"/>
-    <w:bookmarkEnd w:id="25"/>
-    <w:bookmarkStart w:id="32" w:name="gestos-que-se-notan"/>
+    <w:bookmarkEnd w:id="26"/>
+    <w:bookmarkEnd w:id="27"/>
+    <w:bookmarkStart w:id="38" w:name="gestos-que-se-notan"/>
     <w:p>
       <w:pPr>
         <w:pStyle w:val="Heading1"/>
@@ -1527,7 +2435,7 @@
         </w:pict>
       </w:r>
     </w:p>
-    <w:bookmarkStart w:id="26" w:name="en-corto-1"/>
+    <w:bookmarkStart w:id="28" w:name="en-corto-1"/>
     <w:p>
       <w:pPr>
         <w:pStyle w:val="Heading2"/>
@@ -1567,14 +2475,233 @@
         </w:pict>
       </w:r>
     </w:p>
-    <w:bookmarkEnd w:id="26"/>
-    <w:bookmarkStart w:id="27" w:name="los-diez-gestos"/>
+    <w:bookmarkEnd w:id="28"/>
+    <w:bookmarkStart w:id="29" w:name="Xe5b077212db83313fd54bcbc7ca581d9936a4a2"/>
     <w:p>
       <w:pPr>
         <w:pStyle w:val="Heading2"/>
       </w:pPr>
       <w:r>
+        <w:t xml:space="preserve">💡 El compañerismo es una lista de la compra</w:t>
+      </w:r>
+    </w:p>
+    <w:p>
+      <w:pPr>
+        <w:pStyle w:val="FirstParagraph"/>
+      </w:pPr>
+      <w:r>
+        <w:t xml:space="preserve">Si te dijeran</w:t>
+      </w:r>
+      <w:r>
+        <w:t xml:space="preserve"> </w:t>
+      </w:r>
+      <w:r>
+        <w:t xml:space="preserve">“sé más buen rollo”</w:t>
+      </w:r>
+      <w:r>
+        <w:t xml:space="preserve">, ¿sabrías qué hacer el lunes por la mañana?</w:t>
+      </w:r>
+      <w:r>
+        <w:t xml:space="preserve"> </w:t>
+      </w:r>
+      <w:r>
+        <w:rPr>
+          <w:b/>
+          <w:bCs/>
+        </w:rPr>
+        <w:t xml:space="preserve">No.</w:t>
+      </w:r>
+      <w:r>
+        <w:t xml:space="preserve"> </w:t>
+      </w:r>
+      <w:r>
+        <w:t xml:space="preserve">Y es que las frases abstractas no cambian grupos: lo que cambia grupos son</w:t>
+      </w:r>
+      <w:r>
+        <w:t xml:space="preserve"> </w:t>
+      </w:r>
+      <w:r>
+        <w:rPr>
+          <w:b/>
+          <w:bCs/>
+        </w:rPr>
+        <w:t xml:space="preserve">acciones que se pueden ver y contar</w:t>
+      </w:r>
+      <w:r>
+        <w:t xml:space="preserve">.</w:t>
+      </w:r>
+    </w:p>
+    <w:p>
+      <w:pPr>
+        <w:pStyle w:val="BodyText"/>
+      </w:pPr>
+      <w:r>
+        <w:t xml:space="preserve">Por eso esta unidad es una</w:t>
+      </w:r>
+      <w:r>
+        <w:t xml:space="preserve"> </w:t>
+      </w:r>
+      <w:r>
+        <w:rPr>
+          <w:b/>
+          <w:bCs/>
+        </w:rPr>
+        <w:t xml:space="preserve">lista de la compra</w:t>
+      </w:r>
+      <w:r>
+        <w:t xml:space="preserve">: diez gestos observables (si no se ve, no cuenta). Alguien puede decir que</w:t>
+      </w:r>
+      <w:r>
+        <w:t xml:space="preserve"> </w:t>
+      </w:r>
+      <w:r>
+        <w:t xml:space="preserve">“es muy buen compañero”</w:t>
+      </w:r>
+      <w:r>
+        <w:t xml:space="preserve"> </w:t>
+      </w:r>
+      <w:r>
+        <w:t xml:space="preserve">— aquí no vale: aquí se preguntan dos cosas:</w:t>
+      </w:r>
+      <w:r>
+        <w:t xml:space="preserve"> </w:t>
+      </w:r>
+      <w:r>
+        <w:rPr>
+          <w:b/>
+          <w:bCs/>
+        </w:rPr>
+        <w:t xml:space="preserve">¿lo ha hecho esta semana?</w:t>
+      </w:r>
+      <w:r>
+        <w:t xml:space="preserve"> </w:t>
+      </w:r>
+      <w:r>
+        <w:t xml:space="preserve">y</w:t>
+      </w:r>
+      <w:r>
+        <w:t xml:space="preserve"> </w:t>
+      </w:r>
+      <w:r>
+        <w:rPr>
+          <w:b/>
+          <w:bCs/>
+        </w:rPr>
+        <w:t xml:space="preserve">¿quién lo ha visto?</w:t>
+      </w:r>
+    </w:p>
+    <w:p>
+      <w:pPr>
+        <w:pStyle w:val="BodyText"/>
+      </w:pPr>
+      <w:r>
+        <w:t xml:space="preserve">📌</w:t>
+      </w:r>
+      <w:r>
+        <w:t xml:space="preserve"> </w:t>
+      </w:r>
+      <w:r>
+        <w:rPr>
+          <w:b/>
+          <w:bCs/>
+        </w:rPr>
+        <w:t xml:space="preserve">Regla de oro:</w:t>
+      </w:r>
+      <w:r>
+        <w:t xml:space="preserve"> </w:t>
+      </w:r>
+      <w:r>
+        <w:t xml:space="preserve">un gesto sin testigos también vale (tú sabes que lo hiciste), pero los que</w:t>
+      </w:r>
+      <w:r>
+        <w:t xml:space="preserve"> </w:t>
+      </w:r>
+      <w:r>
+        <w:rPr>
+          <w:b/>
+          <w:bCs/>
+        </w:rPr>
+        <w:t xml:space="preserve">se notan</w:t>
+      </w:r>
+      <w:r>
+        <w:t xml:space="preserve"> </w:t>
+      </w:r>
+      <w:r>
+        <w:t xml:space="preserve">son los que el otro ve. El compañerismo necesita público: es lo que hace que el clima cambie de verdad.</w:t>
+      </w:r>
+    </w:p>
+    <w:p>
+      <w:pPr>
+        <w:pStyle w:val="BlockText"/>
+      </w:pPr>
+      <w:r>
+        <w:t xml:space="preserve">💡</w:t>
+      </w:r>
+      <w:r>
+        <w:t xml:space="preserve"> </w:t>
+      </w:r>
+      <w:r>
+        <w:rPr>
+          <w:b/>
+          <w:bCs/>
+        </w:rPr>
+        <w:t xml:space="preserve">Truco de ROSA:</w:t>
+      </w:r>
+      <w:r>
+        <w:t xml:space="preserve"> </w:t>
+      </w:r>
+      <w:r>
+        <w:t xml:space="preserve">“En la tienda hay dos empleados: el que</w:t>
+      </w:r>
+      <w:r>
+        <w:t xml:space="preserve"> </w:t>
+      </w:r>
+      <w:r>
+        <w:t xml:space="preserve">‘es muy majo’</w:t>
+      </w:r>
+      <w:r>
+        <w:t xml:space="preserve"> </w:t>
+      </w:r>
+      <w:r>
+        <w:t xml:space="preserve">y el que te deja la caja cuadrada cuando faltas. El segundo nunca tiene problemas con nadie. Fíjate en qué lista estás tú.”</w:t>
+      </w:r>
+    </w:p>
+    <w:p>
+      <w:r>
+        <w:pict>
+          <v:rect style="width:0;height:1.5pt" o:hralign="center" o:hrstd="t" o:hr="t"/>
+        </w:pict>
+      </w:r>
+    </w:p>
+    <w:bookmarkEnd w:id="29"/>
+    <w:bookmarkStart w:id="31" w:name="los-diez-gestos"/>
+    <w:p>
+      <w:pPr>
+        <w:pStyle w:val="Heading2"/>
+      </w:pPr>
+      <w:r>
         <w:t xml:space="preserve">📋 Los diez gestos</w:t>
+      </w:r>
+    </w:p>
+    <w:p>
+      <w:pPr>
+        <w:pStyle w:val="FirstParagraph"/>
+      </w:pPr>
+      <w:r>
+        <w:t xml:space="preserve">De un vistazo — todos caben en tu semana:</w:t>
+      </w:r>
+    </w:p>
+    <w:p>
+      <w:pPr>
+        <w:pStyle w:val="BodyText"/>
+      </w:pPr>
+    </w:p>
+    <w:p>
+      <w:pPr>
+        <w:pStyle w:val="BodyText"/>
+      </w:pPr>
+      <w:r>
+        <w:t xml:space="preserve">📋 Los 10 gestos — del saludo al chat</w:t>
       </w:r>
     </w:p>
     <w:tbl>
@@ -1994,6 +3121,10 @@
               <w:t xml:space="preserve"> </w:t>
             </w:r>
             <w:r>
+              <w:rPr>
+                <w:b/>
+                <w:bCs/>
+              </w:rPr>
               <w:t xml:space="preserve">mirando</w:t>
             </w:r>
           </w:p>
@@ -2090,41 +3221,131 @@
         </w:tc>
       </w:tr>
     </w:tbl>
-    <w:p>
-      <w:pPr>
-        <w:pStyle w:val="BlockText"/>
-      </w:pPr>
-      <w:r>
-        <w:t xml:space="preserve">💡</w:t>
-      </w:r>
-      <w:r>
-        <w:t xml:space="preserve"> </w:t>
-      </w:r>
-      <w:r>
-        <w:rPr>
-          <w:b/>
-          <w:bCs/>
-        </w:rPr>
-        <w:t xml:space="preserve">Ojo con el gesto que no se nota:</w:t>
-      </w:r>
-      <w:r>
-        <w:t xml:space="preserve"> </w:t>
-      </w:r>
-      <w:r>
-        <w:t xml:space="preserve">el más importante de la lista es el</w:t>
-      </w:r>
-      <w:r>
-        <w:t xml:space="preserve"> </w:t>
-      </w:r>
-      <w:r>
-        <w:rPr>
-          <w:b/>
-          <w:bCs/>
-        </w:rPr>
-        <w:t xml:space="preserve">10</w:t>
-      </w:r>
-      <w:r>
-        <w:t xml:space="preserve">, incluir en el chat. Quedar fuera del grupo digital hoy es quedarse fuera de la clase entera.</w:t>
+    <w:bookmarkStart w:id="30" w:name="los-tres-más-infravalorados"/>
+    <w:p>
+      <w:pPr>
+        <w:pStyle w:val="Heading3"/>
+      </w:pPr>
+      <w:r>
+        <w:t xml:space="preserve">🔎 Los tres más infravalorados</w:t>
+      </w:r>
+    </w:p>
+    <w:p>
+      <w:pPr>
+        <w:pStyle w:val="Compact"/>
+        <w:numPr>
+          <w:ilvl w:val="0"/>
+          <w:numId w:val="1007"/>
+        </w:numPr>
+      </w:pPr>
+      <w:r>
+        <w:t xml:space="preserve">🗣️</w:t>
+      </w:r>
+      <w:r>
+        <w:t xml:space="preserve"> </w:t>
+      </w:r>
+      <w:r>
+        <w:rPr>
+          <w:b/>
+          <w:bCs/>
+        </w:rPr>
+        <w:t xml:space="preserve">El 4 (preguntar de verdad):</w:t>
+      </w:r>
+      <w:r>
+        <w:t xml:space="preserve"> </w:t>
+      </w:r>
+      <w:r>
+        <w:t xml:space="preserve">se ve tonto y es el que más puertas abre. La diferencia entre</w:t>
+      </w:r>
+      <w:r>
+        <w:t xml:space="preserve"> </w:t>
+      </w:r>
+      <w:r>
+        <w:t xml:space="preserve">“¿qué tal?”</w:t>
+      </w:r>
+      <w:r>
+        <w:t xml:space="preserve"> </w:t>
+      </w:r>
+      <w:r>
+        <w:t xml:space="preserve">y</w:t>
+      </w:r>
+      <w:r>
+        <w:t xml:space="preserve"> </w:t>
+      </w:r>
+      <w:r>
+        <w:t xml:space="preserve">“¿y lo del examen?”</w:t>
+      </w:r>
+      <w:r>
+        <w:t xml:space="preserve"> </w:t>
+      </w:r>
+      <w:r>
+        <w:t xml:space="preserve">es enorme.</w:t>
+      </w:r>
+    </w:p>
+    <w:p>
+      <w:pPr>
+        <w:pStyle w:val="Compact"/>
+        <w:numPr>
+          <w:ilvl w:val="0"/>
+          <w:numId w:val="1007"/>
+        </w:numPr>
+      </w:pPr>
+      <w:r>
+        <w:t xml:space="preserve">🙏</w:t>
+      </w:r>
+      <w:r>
+        <w:t xml:space="preserve"> </w:t>
+      </w:r>
+      <w:r>
+        <w:rPr>
+          <w:b/>
+          <w:bCs/>
+        </w:rPr>
+        <w:t xml:space="preserve">El 7 (pedir perdón):</w:t>
+      </w:r>
+      <w:r>
+        <w:t xml:space="preserve"> </w:t>
+      </w:r>
+      <w:r>
+        <w:t xml:space="preserve">parece que resta poder y es lo que más poder da. El que pide perdón pronto, manda en el grupo.</w:t>
+      </w:r>
+    </w:p>
+    <w:p>
+      <w:pPr>
+        <w:pStyle w:val="Compact"/>
+        <w:numPr>
+          <w:ilvl w:val="0"/>
+          <w:numId w:val="1007"/>
+        </w:numPr>
+      </w:pPr>
+      <w:r>
+        <w:t xml:space="preserve">💬</w:t>
+      </w:r>
+      <w:r>
+        <w:t xml:space="preserve"> </w:t>
+      </w:r>
+      <w:r>
+        <w:rPr>
+          <w:b/>
+          <w:bCs/>
+        </w:rPr>
+        <w:t xml:space="preserve">El 10 (el chat):</w:t>
+      </w:r>
+      <w:r>
+        <w:t xml:space="preserve"> </w:t>
+      </w:r>
+      <w:r>
+        <w:rPr>
+          <w:b/>
+          <w:bCs/>
+        </w:rPr>
+        <w:t xml:space="preserve">el más importante de la lista hoy.</w:t>
+      </w:r>
+      <w:r>
+        <w:t xml:space="preserve"> </w:t>
+      </w:r>
+      <w:r>
+        <w:t xml:space="preserve">Quedar fuera del grupo digital es hoy quedarse fuera de la clase entera: ahí se quedan los planes, los apuntes, las risas. Incluir en el chat es incluir en la clase.</w:t>
       </w:r>
     </w:p>
     <w:p>
@@ -2134,8 +3355,9 @@
         </w:pict>
       </w:r>
     </w:p>
-    <w:bookmarkEnd w:id="27"/>
-    <w:bookmarkStart w:id="28" w:name="el-examen-del-espejo"/>
+    <w:bookmarkEnd w:id="30"/>
+    <w:bookmarkEnd w:id="31"/>
+    <w:bookmarkStart w:id="32" w:name="el-examen-del-espejo"/>
     <w:p>
       <w:pPr>
         <w:pStyle w:val="Heading2"/>
@@ -2149,20 +3371,112 @@
         <w:pStyle w:val="FirstParagraph"/>
       </w:pPr>
       <w:r>
-        <w:t xml:space="preserve">Cada gesto tiene su versión en espejo: lo que haces, se copia. Si tú saludas al que entra, otros saldrán a saludar. Si tú te ríes de un error, otros se reirán del tuyo mañana. El clima de un grupo es un espejo gigante:</w:t>
-      </w:r>
-      <w:r>
-        <w:t xml:space="preserve"> </w:t>
-      </w:r>
-      <w:r>
-        <w:rPr>
-          <w:b/>
-          <w:bCs/>
-        </w:rPr>
-        <w:t xml:space="preserve">empieza por lo que tú reflejas</w:t>
-      </w:r>
-      <w:r>
-        <w:t xml:space="preserve">.</w:t>
+        <w:t xml:space="preserve">Cada gesto tiene su versión en espejo:</w:t>
+      </w:r>
+      <w:r>
+        <w:t xml:space="preserve"> </w:t>
+      </w:r>
+      <w:r>
+        <w:rPr>
+          <w:b/>
+          <w:bCs/>
+        </w:rPr>
+        <w:t xml:space="preserve">lo que haces, se copia</w:t>
+      </w:r>
+      <w:r>
+        <w:t xml:space="preserve">. Si tú saludas al que entra, otros saldrán a saludar. Si tú te ríes de un error, otros se reirán del tuyo mañana.</w:t>
+      </w:r>
+    </w:p>
+    <w:p>
+      <w:pPr>
+        <w:pStyle w:val="BodyText"/>
+      </w:pPr>
+      <w:r>
+        <w:t xml:space="preserve">📌</w:t>
+      </w:r>
+      <w:r>
+        <w:t xml:space="preserve"> </w:t>
+      </w:r>
+      <w:r>
+        <w:rPr>
+          <w:b/>
+          <w:bCs/>
+        </w:rPr>
+        <w:t xml:space="preserve">El clima de un grupo es un espejo gigante:</w:t>
+      </w:r>
+      <w:r>
+        <w:t xml:space="preserve"> </w:t>
+      </w:r>
+      <w:r>
+        <w:t xml:space="preserve">empieza por lo que tú reflejas. No esperes a que el grupo cambie para cambiar tú — funciona al revés.</w:t>
+      </w:r>
+    </w:p>
+    <w:p>
+      <w:pPr>
+        <w:pStyle w:val="BodyText"/>
+      </w:pPr>
+      <w:r>
+        <w:t xml:space="preserve">😬</w:t>
+      </w:r>
+      <w:r>
+        <w:t xml:space="preserve"> </w:t>
+      </w:r>
+      <w:r>
+        <w:rPr>
+          <w:b/>
+          <w:bCs/>
+        </w:rPr>
+        <w:t xml:space="preserve">Fail de DANI:</w:t>
+      </w:r>
+      <w:r>
+        <w:t xml:space="preserve"> </w:t>
+      </w:r>
+      <w:r>
+        <w:t xml:space="preserve">DANI pidió perdón con un discurso de tres minutos, un monólogo con música de fondo imaginaria… y al final nadie se acordó del error. ROSA:</w:t>
+      </w:r>
+      <w:r>
+        <w:t xml:space="preserve"> </w:t>
+      </w:r>
+      <w:r>
+        <w:rPr>
+          <w:i/>
+          <w:iCs/>
+        </w:rPr>
+        <w:t xml:space="preserve">“El perdón es una frase, no una novela:</w:t>
+      </w:r>
+      <w:r>
+        <w:rPr>
+          <w:i/>
+          <w:iCs/>
+        </w:rPr>
+        <w:t xml:space="preserve"> </w:t>
+      </w:r>
+      <w:r>
+        <w:rPr>
+          <w:i/>
+          <w:iCs/>
+        </w:rPr>
+        <w:t xml:space="preserve">‘Lo siento, me pasé’</w:t>
+      </w:r>
+      <w:r>
+        <w:rPr>
+          <w:i/>
+          <w:iCs/>
+        </w:rPr>
+        <w:t xml:space="preserve"> </w:t>
+      </w:r>
+      <w:r>
+        <w:rPr>
+          <w:i/>
+          <w:iCs/>
+        </w:rPr>
+        <w:t xml:space="preserve">y a trabajar. Lo largo suena a excusa.”</w:t>
+      </w:r>
+      <w:r>
+        <w:t xml:space="preserve"> </w:t>
+      </w:r>
+      <w:r>
+        <w:t xml:space="preserve">El gesto 7 es corto.</w:t>
       </w:r>
     </w:p>
     <w:p>
@@ -2172,14 +3486,633 @@
         </w:pict>
       </w:r>
     </w:p>
-    <w:bookmarkEnd w:id="28"/>
-    <w:bookmarkStart w:id="29" w:name="mini-chequeo-1"/>
+    <w:p>
+      <w:pPr>
+        <w:pStyle w:val="FirstParagraph"/>
+      </w:pPr>
+      <w:r>
+        <w:t xml:space="preserve">👤 Nombre:</w:t>
+      </w:r>
+      <w:r>
+        <w:t xml:space="preserve"> </w:t>
+      </w:r>
+      <w:r>
+        <w:t xml:space="preserve">📅 Fecha:</w:t>
+      </w:r>
+      <w:r>
+        <w:t xml:space="preserve"> </w:t>
+      </w:r>
+      <w:r>
+        <w:t xml:space="preserve">🏫 Grupo:</w:t>
+      </w:r>
+    </w:p>
+    <w:bookmarkEnd w:id="32"/>
+    <w:bookmarkStart w:id="33" w:name="a-por-ellos-1"/>
     <w:p>
       <w:pPr>
         <w:pStyle w:val="Heading2"/>
       </w:pPr>
       <w:r>
-        <w:t xml:space="preserve">🧠 Mini-chequeo</w:t>
+        <w:t xml:space="preserve">✍️ A por ellos</w:t>
+      </w:r>
+    </w:p>
+    <w:p>
+      <w:pPr>
+        <w:pStyle w:val="FirstParagraph"/>
+      </w:pPr>
+      <w:r>
+        <w:rPr>
+          <w:b/>
+          <w:bCs/>
+        </w:rPr>
+        <w:t xml:space="preserve">1. ✏️ Tu diagnóstico:</w:t>
+      </w:r>
+      <w:r>
+        <w:t xml:space="preserve"> </w:t>
+      </w:r>
+      <w:r>
+        <w:t xml:space="preserve">de los diez gestos, marca con una cruz</w:t>
+      </w:r>
+      <w:r>
+        <w:t xml:space="preserve"> </w:t>
+      </w:r>
+      <w:r>
+        <w:rPr>
+          <w:b/>
+          <w:bCs/>
+        </w:rPr>
+        <w:t xml:space="preserve">los que ya haces</w:t>
+      </w:r>
+      <w:r>
+        <w:t xml:space="preserve"> </w:t>
+      </w:r>
+      <w:r>
+        <w:t xml:space="preserve">y con una estrella</w:t>
+      </w:r>
+      <w:r>
+        <w:t xml:space="preserve"> </w:t>
+      </w:r>
+      <w:r>
+        <w:rPr>
+          <w:b/>
+          <w:bCs/>
+        </w:rPr>
+        <w:t xml:space="preserve">los que puedas empezar mañana</w:t>
+      </w:r>
+      <w:r>
+        <w:t xml:space="preserve">:</w:t>
+      </w:r>
+    </w:p>
+    <w:tbl>
+      <w:tblPr>
+        <w:tblStyle w:val="Table"/>
+        <w:tblW w:type="auto" w:w="0"/>
+        <w:tblLook w:firstRow="1" w:lastRow="0" w:firstColumn="0" w:lastColumn="0" w:noHBand="0" w:noVBand="0" w:val="0020"/>
+      </w:tblPr>
+      <w:tblGrid>
+        <w:gridCol w:w="3960"/>
+        <w:gridCol w:w="3960"/>
+      </w:tblGrid>
+      <w:tr>
+        <w:trPr>
+          <w:tblHeader w:val="on"/>
+        </w:trPr>
+        <w:tc>
+          <w:tcPr/>
+          <w:p>
+            <w:pPr>
+              <w:pStyle w:val="Compact"/>
+            </w:pPr>
+            <w:r>
+              <w:t xml:space="preserve">Gesto</w:t>
+            </w:r>
+          </w:p>
+        </w:tc>
+        <w:tc>
+          <w:tcPr/>
+          <w:p>
+            <w:pPr>
+              <w:pStyle w:val="Compact"/>
+            </w:pPr>
+            <w:r>
+              <w:t xml:space="preserve">✅ ya / ⭐ mañana</w:t>
+            </w:r>
+          </w:p>
+        </w:tc>
+      </w:tr>
+      <w:tr>
+        <w:tc>
+          <w:tcPr/>
+          <w:p>
+            <w:pPr>
+              <w:pStyle w:val="Compact"/>
+            </w:pPr>
+            <w:r>
+              <w:t xml:space="preserve">1. Saludar a quien entra</w:t>
+            </w:r>
+          </w:p>
+        </w:tc>
+        <w:tc>
+          <w:tcPr/>
+          <w:p>
+            <w:pPr>
+              <w:pStyle w:val="Compact"/>
+            </w:pPr>
+          </w:p>
+        </w:tc>
+      </w:tr>
+      <w:tr>
+        <w:tc>
+          <w:tcPr/>
+          <w:p>
+            <w:pPr>
+              <w:pStyle w:val="Compact"/>
+            </w:pPr>
+            <w:r>
+              <w:t xml:space="preserve">2. Invitar al que está solo</w:t>
+            </w:r>
+          </w:p>
+        </w:tc>
+        <w:tc>
+          <w:tcPr/>
+          <w:p>
+            <w:pPr>
+              <w:pStyle w:val="Compact"/>
+            </w:pPr>
+          </w:p>
+        </w:tc>
+      </w:tr>
+      <w:tr>
+        <w:tc>
+          <w:tcPr/>
+          <w:p>
+            <w:pPr>
+              <w:pStyle w:val="Compact"/>
+            </w:pPr>
+            <w:r>
+              <w:t xml:space="preserve">3. Compartir apuntes</w:t>
+            </w:r>
+          </w:p>
+        </w:tc>
+        <w:tc>
+          <w:tcPr/>
+          <w:p>
+            <w:pPr>
+              <w:pStyle w:val="Compact"/>
+            </w:pPr>
+          </w:p>
+        </w:tc>
+      </w:tr>
+      <w:tr>
+        <w:tc>
+          <w:tcPr/>
+          <w:p>
+            <w:pPr>
+              <w:pStyle w:val="Compact"/>
+            </w:pPr>
+            <w:r>
+              <w:t xml:space="preserve">6. No reírte del error ajeno</w:t>
+            </w:r>
+          </w:p>
+        </w:tc>
+        <w:tc>
+          <w:tcPr/>
+          <w:p>
+            <w:pPr>
+              <w:pStyle w:val="Compact"/>
+            </w:pPr>
+          </w:p>
+        </w:tc>
+      </w:tr>
+      <w:tr>
+        <w:tc>
+          <w:tcPr/>
+          <w:p>
+            <w:pPr>
+              <w:pStyle w:val="Compact"/>
+            </w:pPr>
+            <w:r>
+              <w:t xml:space="preserve">10. Incluir en el chat</w:t>
+            </w:r>
+          </w:p>
+        </w:tc>
+        <w:tc>
+          <w:tcPr/>
+          <w:p>
+            <w:pPr>
+              <w:pStyle w:val="Compact"/>
+            </w:pPr>
+          </w:p>
+        </w:tc>
+      </w:tr>
+    </w:tbl>
+    <w:p>
+      <w:pPr>
+        <w:pStyle w:val="BodyText"/>
+      </w:pPr>
+      <w:r>
+        <w:rPr>
+          <w:b/>
+          <w:bCs/>
+        </w:rPr>
+        <w:t xml:space="preserve">2. 💬 El chat:</w:t>
+      </w:r>
+      <w:r>
+        <w:t xml:space="preserve"> </w:t>
+      </w:r>
+      <w:r>
+        <w:t xml:space="preserve">el grupo de clase tiene 24 personas y falta una. Escribe</w:t>
+      </w:r>
+      <w:r>
+        <w:t xml:space="preserve"> </w:t>
+      </w:r>
+      <w:r>
+        <w:rPr>
+          <w:b/>
+          <w:bCs/>
+        </w:rPr>
+        <w:t xml:space="preserve">la frase exacta</w:t>
+      </w:r>
+      <w:r>
+        <w:t xml:space="preserve"> </w:t>
+      </w:r>
+      <w:r>
+        <w:t xml:space="preserve">que escribirías para incluirla:</w:t>
+      </w:r>
+    </w:p>
+    <w:p>
+      <w:pPr>
+        <w:pStyle w:val="BlockText"/>
+      </w:pPr>
+      <w:r>
+        <w:t xml:space="preserve"> </w:t>
+      </w:r>
+    </w:p>
+    <w:p>
+      <w:pPr>
+        <w:pStyle w:val="FirstParagraph"/>
+      </w:pPr>
+      <w:r>
+        <w:rPr>
+          <w:b/>
+          <w:bCs/>
+        </w:rPr>
+        <w:t xml:space="preserve">3. 🙏 Perdón corto:</w:t>
+      </w:r>
+      <w:r>
+        <w:t xml:space="preserve"> </w:t>
+      </w:r>
+      <w:r>
+        <w:t xml:space="preserve">DANI se pasó bromeando con un compañero TODO el recreo. Escribe</w:t>
+      </w:r>
+      <w:r>
+        <w:t xml:space="preserve"> </w:t>
+      </w:r>
+      <w:r>
+        <w:rPr>
+          <w:b/>
+          <w:bCs/>
+        </w:rPr>
+        <w:t xml:space="preserve">tu frase de perdón en una línea</w:t>
+      </w:r>
+      <w:r>
+        <w:t xml:space="preserve"> </w:t>
+      </w:r>
+      <w:r>
+        <w:t xml:space="preserve">(sin discurso):</w:t>
+      </w:r>
+    </w:p>
+    <w:p>
+      <w:pPr>
+        <w:pStyle w:val="BlockText"/>
+      </w:pPr>
+    </w:p>
+    <w:p>
+      <w:pPr>
+        <w:pStyle w:val="FirstParagraph"/>
+      </w:pPr>
+      <w:r>
+        <w:rPr>
+          <w:b/>
+          <w:bCs/>
+        </w:rPr>
+        <w:t xml:space="preserve">4. 🗣️ Pregunta de verdad:</w:t>
+      </w:r>
+      <w:r>
+        <w:t xml:space="preserve"> </w:t>
+      </w:r>
+      <w:r>
+        <w:t xml:space="preserve">reescribe la pregunta decorativa como pregunta de verdad:</w:t>
+      </w:r>
+    </w:p>
+    <w:tbl>
+      <w:tblPr>
+        <w:tblStyle w:val="Table"/>
+        <w:tblW w:type="auto" w:w="0"/>
+        <w:tblLook w:firstRow="1" w:lastRow="0" w:firstColumn="0" w:lastColumn="0" w:noHBand="0" w:noVBand="0" w:val="0020"/>
+      </w:tblPr>
+      <w:tblGrid>
+        <w:gridCol w:w="3960"/>
+        <w:gridCol w:w="3960"/>
+      </w:tblGrid>
+      <w:tr>
+        <w:trPr>
+          <w:tblHeader w:val="on"/>
+        </w:trPr>
+        <w:tc>
+          <w:tcPr/>
+          <w:p>
+            <w:pPr>
+              <w:pStyle w:val="Compact"/>
+            </w:pPr>
+            <w:r>
+              <w:t xml:space="preserve">❌ Decorativa</w:t>
+            </w:r>
+          </w:p>
+        </w:tc>
+        <w:tc>
+          <w:tcPr/>
+          <w:p>
+            <w:pPr>
+              <w:pStyle w:val="Compact"/>
+            </w:pPr>
+            <w:r>
+              <w:t xml:space="preserve">✅ De verdad</w:t>
+            </w:r>
+          </w:p>
+        </w:tc>
+      </w:tr>
+      <w:tr>
+        <w:tc>
+          <w:tcPr/>
+          <w:p>
+            <w:pPr>
+              <w:pStyle w:val="Compact"/>
+            </w:pPr>
+            <w:r>
+              <w:t xml:space="preserve">“¿Qué tal?”</w:t>
+            </w:r>
+          </w:p>
+        </w:tc>
+        <w:tc>
+          <w:tcPr/>
+          <w:p>
+            <w:pPr>
+              <w:pStyle w:val="Compact"/>
+            </w:pPr>
+          </w:p>
+        </w:tc>
+      </w:tr>
+      <w:tr>
+        <w:tc>
+          <w:tcPr/>
+          <w:p>
+            <w:pPr>
+              <w:pStyle w:val="Compact"/>
+            </w:pPr>
+            <w:r>
+              <w:t xml:space="preserve">“¿Estás bien?”</w:t>
+            </w:r>
+          </w:p>
+        </w:tc>
+        <w:tc>
+          <w:tcPr/>
+          <w:p>
+            <w:pPr>
+              <w:pStyle w:val="Compact"/>
+            </w:pPr>
+          </w:p>
+        </w:tc>
+      </w:tr>
+    </w:tbl>
+    <w:p>
+      <w:pPr>
+        <w:pStyle w:val="BodyText"/>
+      </w:pPr>
+      <w:r>
+        <w:rPr>
+          <w:b/>
+          <w:bCs/>
+        </w:rPr>
+        <w:t xml:space="preserve">5. 🛡️ Defender sin insultar:</w:t>
+      </w:r>
+      <w:r>
+        <w:t xml:space="preserve"> </w:t>
+      </w:r>
+      <w:r>
+        <w:t xml:space="preserve">alguien dice</w:t>
+      </w:r>
+      <w:r>
+        <w:t xml:space="preserve"> </w:t>
+      </w:r>
+      <w:r>
+        <w:rPr>
+          <w:i/>
+          <w:iCs/>
+        </w:rPr>
+        <w:t xml:space="preserve">“qué torpe es el nuevo”</w:t>
+      </w:r>
+      <w:r>
+        <w:t xml:space="preserve"> </w:t>
+      </w:r>
+      <w:r>
+        <w:t xml:space="preserve">en el chat de clase. Escribe</w:t>
+      </w:r>
+      <w:r>
+        <w:t xml:space="preserve"> </w:t>
+      </w:r>
+      <w:r>
+        <w:rPr>
+          <w:b/>
+          <w:bCs/>
+        </w:rPr>
+        <w:t xml:space="preserve">tu respuesta</w:t>
+      </w:r>
+      <w:r>
+        <w:t xml:space="preserve"> </w:t>
+      </w:r>
+      <w:r>
+        <w:t xml:space="preserve">que pare al comentario</w:t>
+      </w:r>
+      <w:r>
+        <w:t xml:space="preserve"> </w:t>
+      </w:r>
+      <w:r>
+        <w:rPr>
+          <w:b/>
+          <w:bCs/>
+        </w:rPr>
+        <w:t xml:space="preserve">sin insultar</w:t>
+      </w:r>
+      <w:r>
+        <w:t xml:space="preserve"> </w:t>
+      </w:r>
+      <w:r>
+        <w:t xml:space="preserve">al que insulta:</w:t>
+      </w:r>
+    </w:p>
+    <w:p>
+      <w:pPr>
+        <w:pStyle w:val="BlockText"/>
+      </w:pPr>
+      <w:r>
+        <w:t xml:space="preserve"> </w:t>
+      </w:r>
+    </w:p>
+    <w:p>
+      <w:pPr>
+        <w:pStyle w:val="FirstParagraph"/>
+      </w:pPr>
+      <w:r>
+        <w:rPr>
+          <w:b/>
+          <w:bCs/>
+        </w:rPr>
+        <w:t xml:space="preserve">6. 🪞 El espejo:</w:t>
+      </w:r>
+      <w:r>
+        <w:t xml:space="preserve"> </w:t>
+      </w:r>
+      <w:r>
+        <w:t xml:space="preserve">un gesto que quieras</w:t>
+      </w:r>
+      <w:r>
+        <w:t xml:space="preserve"> </w:t>
+      </w:r>
+      <w:r>
+        <w:rPr>
+          <w:b/>
+          <w:bCs/>
+        </w:rPr>
+        <w:t xml:space="preserve">copiar de alguien de esta clase</w:t>
+      </w:r>
+      <w:r>
+        <w:t xml:space="preserve"> </w:t>
+      </w:r>
+      <w:r>
+        <w:t xml:space="preserve">(que lo hace bien) y por qué:</w:t>
+      </w:r>
+    </w:p>
+    <w:p>
+      <w:pPr>
+        <w:pStyle w:val="BlockText"/>
+      </w:pPr>
+      <w:r>
+        <w:t xml:space="preserve">Lo copio de:</w:t>
+      </w:r>
+      <w:r>
+        <w:t xml:space="preserve"> </w:t>
+      </w:r>
+      <w:r>
+        <w:t xml:space="preserve"> </w:t>
+      </w:r>
+      <w:r>
+        <w:t xml:space="preserve">Porque:</w:t>
+      </w:r>
+      <w:r>
+        <w:t xml:space="preserve"> </w:t>
+      </w:r>
+    </w:p>
+    <w:p>
+      <w:r>
+        <w:pict>
+          <v:rect style="width:0;height:1.5pt" o:hralign="center" o:hrstd="t" o:hr="t"/>
+        </w:pict>
+      </w:r>
+    </w:p>
+    <w:bookmarkEnd w:id="33"/>
+    <w:bookmarkStart w:id="34" w:name="mini-dinámica-el-mercado-de-gestos-5-min"/>
+    <w:p>
+      <w:pPr>
+        <w:pStyle w:val="Heading2"/>
+      </w:pPr>
+      <w:r>
+        <w:t xml:space="preserve">🎭 Mini dinámica: El mercado de gestos 👥 5 min</w:t>
+      </w:r>
+    </w:p>
+    <w:p>
+      <w:pPr>
+        <w:pStyle w:val="FirstParagraph"/>
+      </w:pPr>
+      <w:r>
+        <w:t xml:space="preserve">En pie, libre. Cada uno lleva en la frente un gesto de la lista (la docencia los reparte por sorteo). Consigue que</w:t>
+      </w:r>
+      <w:r>
+        <w:t xml:space="preserve"> </w:t>
+      </w:r>
+      <w:r>
+        <w:rPr>
+          <w:b/>
+          <w:bCs/>
+        </w:rPr>
+        <w:t xml:space="preserve">tres personas</w:t>
+      </w:r>
+      <w:r>
+        <w:t xml:space="preserve"> </w:t>
+      </w:r>
+      <w:r>
+        <w:t xml:space="preserve">te digan en qué día de esta semana van a hacer TU gesto. Gana el que complete tres — pero los tres deben ser de personas distintas.</w:t>
+      </w:r>
+    </w:p>
+    <w:p>
+      <w:pPr>
+        <w:pStyle w:val="BlockText"/>
+      </w:pPr>
+      <w:r>
+        <w:t xml:space="preserve">♿</w:t>
+      </w:r>
+      <w:r>
+        <w:t xml:space="preserve"> </w:t>
+      </w:r>
+      <w:r>
+        <w:rPr>
+          <w:b/>
+          <w:bCs/>
+        </w:rPr>
+        <w:t xml:space="preserve">Inclusión:</w:t>
+      </w:r>
+      <w:r>
+        <w:t xml:space="preserve"> </w:t>
+      </w:r>
+      <w:r>
+        <w:t xml:space="preserve">el sorteo reparte los gestos (nadie elige los suyos); quien tenga dificultad para moverse, la docencia le asigna un gesto</w:t>
+      </w:r>
+      <w:r>
+        <w:t xml:space="preserve"> </w:t>
+      </w:r>
+      <w:r>
+        <w:t xml:space="preserve">“de mesa”</w:t>
+      </w:r>
+      <w:r>
+        <w:t xml:space="preserve"> </w:t>
+      </w:r>
+      <w:r>
+        <w:t xml:space="preserve">(agradecer, felicitar) y sus compañeros pasan por su mesa.</w:t>
+      </w:r>
+    </w:p>
+    <w:p>
+      <w:r>
+        <w:pict>
+          <v:rect style="width:0;height:1.5pt" o:hralign="center" o:hrstd="t" o:hr="t"/>
+        </w:pict>
+      </w:r>
+    </w:p>
+    <w:bookmarkEnd w:id="34"/>
+    <w:bookmarkStart w:id="35" w:name="soluciones-y-pistas-1"/>
+    <w:p>
+      <w:pPr>
+        <w:pStyle w:val="Heading2"/>
+      </w:pPr>
+      <w:r>
+        <w:t xml:space="preserve">🔑 Soluciones y pistas</w:t>
+      </w:r>
+    </w:p>
+    <w:p>
+      <w:pPr>
+        <w:pStyle w:val="FirstParagraph"/>
+      </w:pPr>
+      <w:r>
+        <w:t xml:space="preserve">🔄 Ver soluciones</w:t>
       </w:r>
     </w:p>
     <w:p>
@@ -2191,7 +4124,16 @@
         </w:numPr>
       </w:pPr>
       <w:r>
-        <w:t xml:space="preserve">De los diez gestos, elige dos que ya haces y dos que puedas empezar mañana.</w:t>
+        <w:t xml:space="preserve">Cada cual suyo — pista: si marcaste más de 7</w:t>
+      </w:r>
+      <w:r>
+        <w:t xml:space="preserve"> </w:t>
+      </w:r>
+      <w:r>
+        <w:t xml:space="preserve">“ya haces”</w:t>
+      </w:r>
+      <w:r>
+        <w:t xml:space="preserve">, echa un ojo al espejo: ¿de verdad o te lo crees?</w:t>
       </w:r>
     </w:p>
     <w:p>
@@ -2203,7 +4145,16 @@
         </w:numPr>
       </w:pPr>
       <w:r>
-        <w:t xml:space="preserve">¿Por qué el gesto 10 (incluir en el chat) es hoy de los más importantes?</w:t>
+        <w:t xml:space="preserve">Ejemplo:</w:t>
+      </w:r>
+      <w:r>
+        <w:t xml:space="preserve"> </w:t>
+      </w:r>
+      <w:r>
+        <w:t xml:space="preserve">“Oye, que falto yo en el examen y no me habéis pasado el tema 4 😅 ¿me lo podéis pasar?”</w:t>
+      </w:r>
+      <w:r>
+        <w:t xml:space="preserve">. Pista: escríbelo tú, aunque seas el que falta.</w:t>
       </w:r>
     </w:p>
     <w:p>
@@ -2215,7 +4166,88 @@
         </w:numPr>
       </w:pPr>
       <w:r>
-        <w:t xml:space="preserve">¿Qué gesto sirve también como defensa del grupo ante las burlas?</w:t>
+        <w:t xml:space="preserve">Ejemplo:</w:t>
+      </w:r>
+      <w:r>
+        <w:t xml:space="preserve"> </w:t>
+      </w:r>
+      <w:r>
+        <w:t xml:space="preserve">“Lo siento, me pasé contigo. No volverá.”</w:t>
+      </w:r>
+      <w:r>
+        <w:t xml:space="preserve"> </w:t>
+      </w:r>
+      <w:r>
+        <w:t xml:space="preserve">Corto y sin excusas.</w:t>
+      </w:r>
+    </w:p>
+    <w:p>
+      <w:pPr>
+        <w:pStyle w:val="Compact"/>
+        <w:numPr>
+          <w:ilvl w:val="0"/>
+          <w:numId w:val="1008"/>
+        </w:numPr>
+      </w:pPr>
+      <w:r>
+        <w:t xml:space="preserve">“¿Qué tal el examen de ayer?”</w:t>
+      </w:r>
+      <w:r>
+        <w:t xml:space="preserve"> </w:t>
+      </w:r>
+      <w:r>
+        <w:t xml:space="preserve">·</w:t>
+      </w:r>
+      <w:r>
+        <w:t xml:space="preserve"> </w:t>
+      </w:r>
+      <w:r>
+        <w:t xml:space="preserve">“Veo que estás callado, ¿quieres hablar o prefieres que te deje?”</w:t>
+      </w:r>
+      <w:r>
+        <w:t xml:space="preserve">.</w:t>
+      </w:r>
+    </w:p>
+    <w:p>
+      <w:pPr>
+        <w:pStyle w:val="Compact"/>
+        <w:numPr>
+          <w:ilvl w:val="0"/>
+          <w:numId w:val="1008"/>
+        </w:numPr>
+      </w:pPr>
+      <w:r>
+        <w:t xml:space="preserve">Ejemplos:</w:t>
+      </w:r>
+      <w:r>
+        <w:t xml:space="preserve"> </w:t>
+      </w:r>
+      <w:r>
+        <w:t xml:space="preserve">“Eh, dejadlo, que no es para tanto”</w:t>
+      </w:r>
+      <w:r>
+        <w:t xml:space="preserve">,</w:t>
+      </w:r>
+      <w:r>
+        <w:t xml:space="preserve"> </w:t>
+      </w:r>
+      <w:r>
+        <w:t xml:space="preserve">“Yo también fui nuevo, calmados”</w:t>
+      </w:r>
+      <w:r>
+        <w:t xml:space="preserve">. Pista: habla del comentario, no del comentarista.</w:t>
+      </w:r>
+    </w:p>
+    <w:p>
+      <w:pPr>
+        <w:pStyle w:val="Compact"/>
+        <w:numPr>
+          <w:ilvl w:val="0"/>
+          <w:numId w:val="1008"/>
+        </w:numPr>
+      </w:pPr>
+      <w:r>
+        <w:t xml:space="preserve">Cada cual suyo.</w:t>
       </w:r>
     </w:p>
     <w:p>
@@ -2225,8 +4257,8 @@
         </w:pict>
       </w:r>
     </w:p>
-    <w:bookmarkEnd w:id="29"/>
-    <w:bookmarkStart w:id="30" w:name="resumen-en-3-frases-1"/>
+    <w:bookmarkEnd w:id="35"/>
+    <w:bookmarkStart w:id="36" w:name="resumen-en-3-frases"/>
     <w:p>
       <w:pPr>
         <w:pStyle w:val="Heading2"/>
@@ -2278,14 +4310,14 @@
         </w:pict>
       </w:r>
     </w:p>
-    <w:bookmarkEnd w:id="30"/>
-    <w:bookmarkStart w:id="31" w:name="vocabulario-rápido-1"/>
+    <w:bookmarkEnd w:id="36"/>
+    <w:bookmarkStart w:id="37" w:name="vocabulario-rápido-1"/>
     <w:p>
       <w:pPr>
         <w:pStyle w:val="Heading2"/>
       </w:pPr>
       <w:r>
-        <w:t xml:space="preserve">🐛 Vocabulario rápido</w:t>
+        <w:t xml:space="preserve">📛 Vocabulario rápido</w:t>
       </w:r>
     </w:p>
     <w:p>
@@ -2371,7 +4403,7 @@
       <w:r>
         <w:t xml:space="preserve"> </w:t>
       </w:r>
-      <w:hyperlink r:id="rId23">
+      <w:hyperlink r:id="rId25">
         <w:r>
           <w:rPr>
             <w:rStyle w:val="Hyperlink"/>
@@ -2434,9 +4466,9 @@
         </w:r>
       </w:hyperlink>
     </w:p>
-    <w:bookmarkEnd w:id="31"/>
-    <w:bookmarkEnd w:id="32"/>
-    <w:bookmarkStart w:id="40" w:name="juegos-y-retos"/>
+    <w:bookmarkEnd w:id="37"/>
+    <w:bookmarkEnd w:id="38"/>
+    <w:bookmarkStart w:id="50" w:name="juegos-y-retos"/>
     <w:p>
       <w:pPr>
         <w:pStyle w:val="Heading1"/>
@@ -2500,30 +4532,13 @@
         </w:pict>
       </w:r>
     </w:p>
-    <w:bookmarkStart w:id="33" w:name="el-fail-de-dani-el-nuevo"/>
+    <w:bookmarkStart w:id="39" w:name="en-corto-2"/>
     <w:p>
       <w:pPr>
         <w:pStyle w:val="Heading2"/>
       </w:pPr>
       <w:r>
-        <w:t xml:space="preserve">😬 El fail de DANI: el nuevo</w:t>
-      </w:r>
-    </w:p>
-    <w:p>
-      <w:pPr>
-        <w:pStyle w:val="FirstParagraph"/>
-      </w:pPr>
-      <w:r>
-        <w:t xml:space="preserve">DANI llevaba dos semanas en la tienda y nadie le había hablado más allá de un</w:t>
-      </w:r>
-      <w:r>
-        <w:t xml:space="preserve"> </w:t>
-      </w:r>
-      <w:r>
-        <w:t xml:space="preserve">“pásame eso”</w:t>
-      </w:r>
-      <w:r>
-        <w:t xml:space="preserve">. Un día Rosa le preguntó por qué no se acercaba al resto.</w:t>
+        <w:t xml:space="preserve">📬 En corto</w:t>
       </w:r>
     </w:p>
     <w:p>
@@ -2531,131 +4546,7 @@
         <w:pStyle w:val="BlockText"/>
       </w:pPr>
       <w:r>
-        <w:t xml:space="preserve">—</w:t>
-      </w:r>
-      <w:r>
-        <w:t xml:space="preserve"> </w:t>
-      </w:r>
-      <w:r>
-        <w:rPr>
-          <w:b/>
-          <w:bCs/>
-        </w:rPr>
-        <w:t xml:space="preserve">DANI:</w:t>
-      </w:r>
-      <w:r>
-        <w:t xml:space="preserve"> </w:t>
-      </w:r>
-      <w:r>
-        <w:t xml:space="preserve">Es que… me miran raro.</w:t>
-      </w:r>
-      <w:r>
-        <w:t xml:space="preserve"> </w:t>
-      </w:r>
-      <w:r>
-        <w:t xml:space="preserve">—</w:t>
-      </w:r>
-      <w:r>
-        <w:t xml:space="preserve"> </w:t>
-      </w:r>
-      <w:r>
-        <w:rPr>
-          <w:b/>
-          <w:bCs/>
-        </w:rPr>
-        <w:t xml:space="preserve">ROSA:</w:t>
-      </w:r>
-      <w:r>
-        <w:t xml:space="preserve"> </w:t>
-      </w:r>
-      <w:r>
-        <w:t xml:space="preserve">Tú también los miras raro, campeón. Los dos estáis esperando que el otro empiece.</w:t>
-      </w:r>
-      <w:r>
-        <w:t xml:space="preserve"> </w:t>
-      </w:r>
-      <w:r>
-        <w:t xml:space="preserve">—</w:t>
-      </w:r>
-      <w:r>
-        <w:t xml:space="preserve"> </w:t>
-      </w:r>
-      <w:r>
-        <w:rPr>
-          <w:b/>
-          <w:bCs/>
-        </w:rPr>
-        <w:t xml:space="preserve">DANI:</w:t>
-      </w:r>
-      <w:r>
-        <w:t xml:space="preserve"> </w:t>
-      </w:r>
-      <w:r>
-        <w:t xml:space="preserve">¿Y yo qué hago?</w:t>
-      </w:r>
-      <w:r>
-        <w:t xml:space="preserve"> </w:t>
-      </w:r>
-      <w:r>
-        <w:t xml:space="preserve">—</w:t>
-      </w:r>
-      <w:r>
-        <w:t xml:space="preserve"> </w:t>
-      </w:r>
-      <w:r>
-        <w:rPr>
-          <w:b/>
-          <w:bCs/>
-        </w:rPr>
-        <w:t xml:space="preserve">ROSA:</w:t>
-      </w:r>
-      <w:r>
-        <w:t xml:space="preserve"> </w:t>
-      </w:r>
-      <w:r>
-        <w:t xml:space="preserve">Saluda. Pregunta algo. Da un paso. En esta tienda, el que ayuda al nuevo a la semana ya es veterano. El que espera un mes, sigue siendo el del rincón.</w:t>
-      </w:r>
-    </w:p>
-    <w:p>
-      <w:pPr>
-        <w:pStyle w:val="FirstParagraph"/>
-      </w:pPr>
-      <w:r>
-        <w:rPr>
-          <w:b/>
-          <w:bCs/>
-        </w:rPr>
-        <w:t xml:space="preserve">La lección:</w:t>
-      </w:r>
-      <w:r>
-        <w:t xml:space="preserve"> </w:t>
-      </w:r>
-      <w:r>
-        <w:t xml:space="preserve">el</w:t>
-      </w:r>
-      <w:r>
-        <w:t xml:space="preserve"> </w:t>
-      </w:r>
-      <w:r>
-        <w:t xml:space="preserve">“que no me hablan”</w:t>
-      </w:r>
-      <w:r>
-        <w:t xml:space="preserve"> </w:t>
-      </w:r>
-      <w:r>
-        <w:t xml:space="preserve">suele ser un empate: todos esperando. Alguien tiene que dar el primer paso, y ese alguien puede ser tú. Un</w:t>
-      </w:r>
-      <w:r>
-        <w:t xml:space="preserve"> </w:t>
-      </w:r>
-      <w:r>
-        <w:t xml:space="preserve">“¿qué tal el primer día?”</w:t>
-      </w:r>
-      <w:r>
-        <w:t xml:space="preserve"> </w:t>
-      </w:r>
-      <w:r>
-        <w:t xml:space="preserve">cuesta dos segundos y cambia la semana de otra persona.</w:t>
+        <w:t xml:space="preserve">Hoy toca jugar al compañerismo: el fail del nuevo, la misión invisible de la semana y retos para el recreo.</w:t>
       </w:r>
     </w:p>
     <w:p>
@@ -2665,8 +4556,243 @@
         </w:pict>
       </w:r>
     </w:p>
-    <w:bookmarkEnd w:id="33"/>
-    <w:bookmarkStart w:id="34" w:name="cara-a-cara-incluir-vs-mirar-a-otro-lado"/>
+    <w:bookmarkEnd w:id="39"/>
+    <w:bookmarkStart w:id="40" w:name="el-fail-de-dani-el-nuevo"/>
+    <w:p>
+      <w:pPr>
+        <w:pStyle w:val="Heading2"/>
+      </w:pPr>
+      <w:r>
+        <w:t xml:space="preserve">😬 El fail de DANI: el nuevo</w:t>
+      </w:r>
+    </w:p>
+    <w:p>
+      <w:pPr>
+        <w:pStyle w:val="FirstParagraph"/>
+      </w:pPr>
+      <w:r>
+        <w:t xml:space="preserve">DANI llevaba dos semanas en la tienda y nadie le había hablado más allá de un</w:t>
+      </w:r>
+      <w:r>
+        <w:t xml:space="preserve"> </w:t>
+      </w:r>
+      <w:r>
+        <w:t xml:space="preserve">“pásame eso”</w:t>
+      </w:r>
+      <w:r>
+        <w:t xml:space="preserve">. Un día ROSA le preguntó por qué no se acercaba al resto.</w:t>
+      </w:r>
+    </w:p>
+    <w:p>
+      <w:pPr>
+        <w:pStyle w:val="BlockText"/>
+      </w:pPr>
+      <w:r>
+        <w:t xml:space="preserve">—</w:t>
+      </w:r>
+      <w:r>
+        <w:t xml:space="preserve"> </w:t>
+      </w:r>
+      <w:r>
+        <w:rPr>
+          <w:b/>
+          <w:bCs/>
+        </w:rPr>
+        <w:t xml:space="preserve">DANI:</w:t>
+      </w:r>
+      <w:r>
+        <w:t xml:space="preserve"> </w:t>
+      </w:r>
+      <w:r>
+        <w:t xml:space="preserve">Es que… me miran raro.</w:t>
+      </w:r>
+      <w:r>
+        <w:t xml:space="preserve"> </w:t>
+      </w:r>
+      <w:r>
+        <w:t xml:space="preserve">—</w:t>
+      </w:r>
+      <w:r>
+        <w:t xml:space="preserve"> </w:t>
+      </w:r>
+      <w:r>
+        <w:rPr>
+          <w:b/>
+          <w:bCs/>
+        </w:rPr>
+        <w:t xml:space="preserve">ROSA:</w:t>
+      </w:r>
+      <w:r>
+        <w:t xml:space="preserve"> </w:t>
+      </w:r>
+      <w:r>
+        <w:rPr>
+          <w:b/>
+          <w:bCs/>
+        </w:rPr>
+        <w:t xml:space="preserve">Tú también los miras raro</w:t>
+      </w:r>
+      <w:r>
+        <w:t xml:space="preserve">, campeón. Los dos estáis esperando que el otro empiece.</w:t>
+      </w:r>
+      <w:r>
+        <w:t xml:space="preserve"> </w:t>
+      </w:r>
+      <w:r>
+        <w:t xml:space="preserve">—</w:t>
+      </w:r>
+      <w:r>
+        <w:t xml:space="preserve"> </w:t>
+      </w:r>
+      <w:r>
+        <w:rPr>
+          <w:b/>
+          <w:bCs/>
+        </w:rPr>
+        <w:t xml:space="preserve">DANI:</w:t>
+      </w:r>
+      <w:r>
+        <w:t xml:space="preserve"> </w:t>
+      </w:r>
+      <w:r>
+        <w:t xml:space="preserve">¿Y yo qué hago?</w:t>
+      </w:r>
+      <w:r>
+        <w:t xml:space="preserve"> </w:t>
+      </w:r>
+      <w:r>
+        <w:t xml:space="preserve">—</w:t>
+      </w:r>
+      <w:r>
+        <w:t xml:space="preserve"> </w:t>
+      </w:r>
+      <w:r>
+        <w:rPr>
+          <w:b/>
+          <w:bCs/>
+        </w:rPr>
+        <w:t xml:space="preserve">ROSA:</w:t>
+      </w:r>
+      <w:r>
+        <w:t xml:space="preserve"> </w:t>
+      </w:r>
+      <w:r>
+        <w:t xml:space="preserve">Saluda. Pregunta algo. Da un paso. En esta tienda, el que ayuda al nuevo a la semana ya es veterano. El que espera un mes, sigue siendo el del rincón.</w:t>
+      </w:r>
+    </w:p>
+    <w:p>
+      <w:pPr>
+        <w:pStyle w:val="FirstParagraph"/>
+      </w:pPr>
+      <w:r>
+        <w:rPr>
+          <w:b/>
+          <w:bCs/>
+        </w:rPr>
+        <w:t xml:space="preserve">La lección:</w:t>
+      </w:r>
+      <w:r>
+        <w:t xml:space="preserve"> </w:t>
+      </w:r>
+      <w:r>
+        <w:t xml:space="preserve">el</w:t>
+      </w:r>
+      <w:r>
+        <w:t xml:space="preserve"> </w:t>
+      </w:r>
+      <w:r>
+        <w:t xml:space="preserve">“que no me hablan”</w:t>
+      </w:r>
+      <w:r>
+        <w:t xml:space="preserve"> </w:t>
+      </w:r>
+      <w:r>
+        <w:t xml:space="preserve">suele ser un</w:t>
+      </w:r>
+      <w:r>
+        <w:t xml:space="preserve"> </w:t>
+      </w:r>
+      <w:r>
+        <w:rPr>
+          <w:b/>
+          <w:bCs/>
+        </w:rPr>
+        <w:t xml:space="preserve">empate</w:t>
+      </w:r>
+      <w:r>
+        <w:t xml:space="preserve">: todos esperando. Alguien tiene que dar el primer paso, y ese alguien puede ser tú. Un</w:t>
+      </w:r>
+      <w:r>
+        <w:t xml:space="preserve"> </w:t>
+      </w:r>
+      <w:r>
+        <w:t xml:space="preserve">“¿qué tal el primer día?”</w:t>
+      </w:r>
+      <w:r>
+        <w:t xml:space="preserve"> </w:t>
+      </w:r>
+      <w:r>
+        <w:t xml:space="preserve">cuesta dos segundos y cambia la semana de otra persona.</w:t>
+      </w:r>
+    </w:p>
+    <w:p>
+      <w:pPr>
+        <w:pStyle w:val="BodyText"/>
+      </w:pPr>
+      <w:r>
+        <w:t xml:space="preserve">📌</w:t>
+      </w:r>
+      <w:r>
+        <w:t xml:space="preserve"> </w:t>
+      </w:r>
+      <w:r>
+        <w:rPr>
+          <w:b/>
+          <w:bCs/>
+        </w:rPr>
+        <w:t xml:space="preserve">Dato clave:</w:t>
+      </w:r>
+      <w:r>
+        <w:t xml:space="preserve"> </w:t>
+      </w:r>
+      <w:r>
+        <w:t xml:space="preserve">en las encuestas de convivencia, la frase</w:t>
+      </w:r>
+      <w:r>
+        <w:t xml:space="preserve"> </w:t>
+      </w:r>
+      <w:r>
+        <w:t xml:space="preserve">“llevaba semanas y nadie me hablaba”</w:t>
+      </w:r>
+      <w:r>
+        <w:t xml:space="preserve"> </w:t>
+      </w:r>
+      <w:r>
+        <w:t xml:space="preserve">es la más repetida…</w:t>
+      </w:r>
+      <w:r>
+        <w:t xml:space="preserve"> </w:t>
+      </w:r>
+      <w:r>
+        <w:rPr>
+          <w:b/>
+          <w:bCs/>
+        </w:rPr>
+        <w:t xml:space="preserve">y la mayoría de la clase la piensa</w:t>
+      </w:r>
+      <w:r>
+        <w:t xml:space="preserve">. Es decir: casi todos quieren que les hablen y casi nadie empieza. Tú empieza y ganas la partida.</w:t>
+      </w:r>
+    </w:p>
+    <w:p>
+      <w:r>
+        <w:pict>
+          <v:rect style="width:0;height:1.5pt" o:hralign="center" o:hrstd="t" o:hr="t"/>
+        </w:pict>
+      </w:r>
+    </w:p>
+    <w:bookmarkEnd w:id="40"/>
+    <w:bookmarkStart w:id="41" w:name="cara-a-cara-incluir-vs-mirar-a-otro-lado"/>
     <w:p>
       <w:pPr>
         <w:pStyle w:val="Heading2"/>
@@ -2697,18 +4823,50 @@
               <w:pStyle w:val="Compact"/>
             </w:pPr>
             <w:r>
-              <w:t xml:space="preserve">⚔️ Mirar a otro lado</w:t>
-            </w:r>
-          </w:p>
-        </w:tc>
-        <w:tc>
-          <w:tcPr/>
-          <w:p>
-            <w:pPr>
-              <w:pStyle w:val="Compact"/>
-            </w:pPr>
-            <w:r>
-              <w:t xml:space="preserve">⚔️ Incluir</w:t>
+              <w:t xml:space="preserve">⚔️</w:t>
+            </w:r>
+            <w:r>
+              <w:t xml:space="preserve"> </w:t>
+            </w:r>
+            <w:r>
+              <w:rPr>
+                <w:b/>
+                <w:bCs/>
+              </w:rPr>
+              <w:t xml:space="preserve">Mirar a otro lado</w:t>
+            </w:r>
+            <w:r>
+              <w:t xml:space="preserve"> </w:t>
+            </w:r>
+            <w:r>
+              <w:t xml:space="preserve">👀</w:t>
+            </w:r>
+          </w:p>
+        </w:tc>
+        <w:tc>
+          <w:tcPr/>
+          <w:p>
+            <w:pPr>
+              <w:pStyle w:val="Compact"/>
+            </w:pPr>
+            <w:r>
+              <w:t xml:space="preserve">⚔️</w:t>
+            </w:r>
+            <w:r>
+              <w:t xml:space="preserve"> </w:t>
+            </w:r>
+            <w:r>
+              <w:rPr>
+                <w:b/>
+                <w:bCs/>
+              </w:rPr>
+              <w:t xml:space="preserve">Incluir</w:t>
+            </w:r>
+            <w:r>
+              <w:t xml:space="preserve"> </w:t>
+            </w:r>
+            <w:r>
+              <w:t xml:space="preserve">🤝</w:t>
             </w:r>
           </w:p>
         </w:tc>
@@ -2732,7 +4890,7 @@
               <w:pStyle w:val="Compact"/>
             </w:pPr>
             <w:r>
-              <w:t xml:space="preserve">“¿Te apeteces venir?”</w:t>
+              <w:t xml:space="preserve">“¿Te apetece venir?”</w:t>
             </w:r>
           </w:p>
         </w:tc>
@@ -2745,18 +4903,38 @@
               <w:pStyle w:val="Compact"/>
             </w:pPr>
             <w:r>
-              <w:t xml:space="preserve">El grupo se queda pequeño</w:t>
-            </w:r>
-          </w:p>
-        </w:tc>
-        <w:tc>
-          <w:tcPr/>
-          <w:p>
-            <w:pPr>
-              <w:pStyle w:val="Compact"/>
-            </w:pPr>
-            <w:r>
-              <w:t xml:space="preserve">El grupo gana gente</w:t>
+              <w:t xml:space="preserve">El grupo se queda</w:t>
+            </w:r>
+            <w:r>
+              <w:t xml:space="preserve"> </w:t>
+            </w:r>
+            <w:r>
+              <w:rPr>
+                <w:b/>
+                <w:bCs/>
+              </w:rPr>
+              <w:t xml:space="preserve">pequeño</w:t>
+            </w:r>
+          </w:p>
+        </w:tc>
+        <w:tc>
+          <w:tcPr/>
+          <w:p>
+            <w:pPr>
+              <w:pStyle w:val="Compact"/>
+            </w:pPr>
+            <w:r>
+              <w:t xml:space="preserve">El grupo</w:t>
+            </w:r>
+            <w:r>
+              <w:t xml:space="preserve"> </w:t>
+            </w:r>
+            <w:r>
+              <w:rPr>
+                <w:b/>
+                <w:bCs/>
+              </w:rPr>
+              <w:t xml:space="preserve">gana gente</w:t>
             </w:r>
           </w:p>
         </w:tc>
@@ -2793,18 +4971,47 @@
               <w:pStyle w:val="Compact"/>
             </w:pPr>
             <w:r>
-              <w:t xml:space="preserve">Cuesta cero esfuerzo… y cuesta la clase</w:t>
-            </w:r>
-          </w:p>
-        </w:tc>
-        <w:tc>
-          <w:tcPr/>
-          <w:p>
-            <w:pPr>
-              <w:pStyle w:val="Compact"/>
-            </w:pPr>
-            <w:r>
-              <w:t xml:space="preserve">Cuesta dos segundos… y salva el clima</w:t>
+              <w:t xml:space="preserve">Cuesta</w:t>
+            </w:r>
+            <w:r>
+              <w:t xml:space="preserve"> </w:t>
+            </w:r>
+            <w:r>
+              <w:rPr>
+                <w:b/>
+                <w:bCs/>
+              </w:rPr>
+              <w:t xml:space="preserve">cero</w:t>
+            </w:r>
+            <w:r>
+              <w:t xml:space="preserve"> </w:t>
+            </w:r>
+            <w:r>
+              <w:t xml:space="preserve">esfuerzo… y cuesta la clase</w:t>
+            </w:r>
+          </w:p>
+        </w:tc>
+        <w:tc>
+          <w:tcPr/>
+          <w:p>
+            <w:pPr>
+              <w:pStyle w:val="Compact"/>
+            </w:pPr>
+            <w:r>
+              <w:t xml:space="preserve">Cuesta</w:t>
+            </w:r>
+            <w:r>
+              <w:t xml:space="preserve"> </w:t>
+            </w:r>
+            <w:r>
+              <w:rPr>
+                <w:b/>
+                <w:bCs/>
+              </w:rPr>
+              <w:t xml:space="preserve">dos segundos</w:t>
+            </w:r>
+            <w:r>
+              <w:t xml:space="preserve">… y salva el clima</w:t>
             </w:r>
           </w:p>
         </w:tc>
@@ -2831,7 +5038,79 @@
         <w:t xml:space="preserve"> </w:t>
       </w:r>
       <w:r>
-        <w:t xml:space="preserve">mirar a otro lado es gratis hoy y carísimo mañana. Incluir es caro hoy (dos segundos) y gratis mañana: una clase que funciona.</w:t>
+        <w:t xml:space="preserve">mirar a otro lado es gratis hoy y</w:t>
+      </w:r>
+      <w:r>
+        <w:t xml:space="preserve"> </w:t>
+      </w:r>
+      <w:r>
+        <w:rPr>
+          <w:b/>
+          <w:bCs/>
+        </w:rPr>
+        <w:t xml:space="preserve">carísimo</w:t>
+      </w:r>
+      <w:r>
+        <w:t xml:space="preserve"> </w:t>
+      </w:r>
+      <w:r>
+        <w:t xml:space="preserve">mañana. Incluir es caro hoy (dos segundos) y gratis mañana: una clase que funciona.</w:t>
+      </w:r>
+    </w:p>
+    <w:p>
+      <w:pPr>
+        <w:pStyle w:val="FirstParagraph"/>
+      </w:pPr>
+      <w:r>
+        <w:rPr>
+          <w:b/>
+          <w:bCs/>
+        </w:rPr>
+        <w:t xml:space="preserve">Ejemplo real:</w:t>
+      </w:r>
+      <w:r>
+        <w:t xml:space="preserve"> </w:t>
+      </w:r>
+      <w:r>
+        <w:t xml:space="preserve">en un ciclo de FP, el grupo tenía un chat de 22. Uno faltaba siempre del</w:t>
+      </w:r>
+      <w:r>
+        <w:t xml:space="preserve"> </w:t>
+      </w:r>
+      <w:r>
+        <w:t xml:space="preserve">“café de viernes”</w:t>
+      </w:r>
+      <w:r>
+        <w:t xml:space="preserve">. Una compañera empezó a escribirle</w:t>
+      </w:r>
+      <w:r>
+        <w:t xml:space="preserve"> </w:t>
+      </w:r>
+      <w:r>
+        <w:rPr>
+          <w:i/>
+          <w:iCs/>
+        </w:rPr>
+        <w:t xml:space="preserve">“te esperamos, es a las X”</w:t>
+      </w:r>
+      <w:r>
+        <w:t xml:space="preserve">. Al mes, ese chico organizó el cumpleaños del grupo.</w:t>
+      </w:r>
+      <w:r>
+        <w:t xml:space="preserve"> </w:t>
+      </w:r>
+      <w:r>
+        <w:rPr>
+          <w:b/>
+          <w:bCs/>
+        </w:rPr>
+        <w:t xml:space="preserve">Un mensaje.</w:t>
+      </w:r>
+      <w:r>
+        <w:t xml:space="preserve"> </w:t>
+      </w:r>
+      <w:r>
+        <w:t xml:space="preserve">Lo que faltaba no era voluntad: era que alguien diera el paso.</w:t>
       </w:r>
     </w:p>
     <w:p>
@@ -2841,8 +5120,8 @@
         </w:pict>
       </w:r>
     </w:p>
-    <w:bookmarkEnd w:id="34"/>
-    <w:bookmarkStart w:id="35" w:name="reto-mental"/>
+    <w:bookmarkEnd w:id="41"/>
+    <w:bookmarkStart w:id="42" w:name="reto-mental"/>
     <w:p>
       <w:pPr>
         <w:pStyle w:val="Heading2"/>
@@ -2868,7 +5147,20 @@
         </w:numPr>
       </w:pPr>
       <w:r>
-        <w:t xml:space="preserve">En clase hay alguien que siempre come solo. Escribe el gesto 2 aplicado, con palabras exactas.</w:t>
+        <w:t xml:space="preserve">🍽️ En clase hay alguien que siempre come solo. Escribe el gesto 2 aplicado,</w:t>
+      </w:r>
+      <w:r>
+        <w:t xml:space="preserve"> </w:t>
+      </w:r>
+      <w:r>
+        <w:rPr>
+          <w:b/>
+          <w:bCs/>
+        </w:rPr>
+        <w:t xml:space="preserve">con palabras exactas</w:t>
+      </w:r>
+      <w:r>
+        <w:t xml:space="preserve">.</w:t>
       </w:r>
     </w:p>
     <w:p>
@@ -2880,7 +5172,20 @@
         </w:numPr>
       </w:pPr>
       <w:r>
-        <w:t xml:space="preserve">Un compañero acaba de hacer una presentación que le salió regular. ¿Cuál de los diez gestos aplica y cuál NO?</w:t>
+        <w:t xml:space="preserve">🎤 Un compañero acaba de hacer una presentación que le salió regular. ¿Cuál de los diez gestos aplica y cuál</w:t>
+      </w:r>
+      <w:r>
+        <w:t xml:space="preserve"> </w:t>
+      </w:r>
+      <w:r>
+        <w:rPr>
+          <w:b/>
+          <w:bCs/>
+        </w:rPr>
+        <w:t xml:space="preserve">NO</w:t>
+      </w:r>
+      <w:r>
+        <w:t xml:space="preserve">?</w:t>
       </w:r>
     </w:p>
     <w:p>
@@ -2892,7 +5197,7 @@
         </w:numPr>
       </w:pPr>
       <w:r>
-        <w:t xml:space="preserve">¿Por qué el gesto 9 (defender con respeto) es más potente que no decir nada?</w:t>
+        <w:t xml:space="preserve">🛡️ ¿Por qué el gesto 9 (defender con respeto) es más potente que no decir nada?</w:t>
       </w:r>
     </w:p>
     <w:p>
@@ -2918,6 +5223,10 @@
         <w:t xml:space="preserve"> </w:t>
       </w:r>
       <w:r>
+        <w:rPr>
+          <w:i/>
+          <w:iCs/>
+        </w:rPr>
         <w:t xml:space="preserve">“Oye, ¿te apeteces sentarte con nosotros al recreo?”</w:t>
       </w:r>
       <w:r>
@@ -2936,7 +5245,17 @@
         </w:numPr>
       </w:pPr>
       <w:r>
-        <w:t xml:space="preserve">Aplica el 5 (</w:t>
+        <w:rPr>
+          <w:b/>
+          <w:bCs/>
+        </w:rPr>
+        <w:t xml:space="preserve">Aplica el 5</w:t>
+      </w:r>
+      <w:r>
+        <w:t xml:space="preserve"> </w:t>
+      </w:r>
+      <w:r>
+        <w:t xml:space="preserve">(</w:t>
       </w:r>
       <w:r>
         <w:t xml:space="preserve">“felicitar”</w:t>
@@ -2951,10 +5270,30 @@
         <w:t xml:space="preserve"> </w:t>
       </w:r>
       <w:r>
+        <w:rPr>
+          <w:i/>
+          <w:iCs/>
+        </w:rPr>
         <w:t xml:space="preserve">“te has atrevido, que no es poco”</w:t>
       </w:r>
       <w:r>
-        <w:t xml:space="preserve">). NO aplica el 6 (reírse del error) ni comentarios tipo</w:t>
+        <w:t xml:space="preserve">).</w:t>
+      </w:r>
+      <w:r>
+        <w:t xml:space="preserve"> </w:t>
+      </w:r>
+      <w:r>
+        <w:rPr>
+          <w:b/>
+          <w:bCs/>
+        </w:rPr>
+        <w:t xml:space="preserve">NO aplica el 6</w:t>
+      </w:r>
+      <w:r>
+        <w:t xml:space="preserve"> </w:t>
+      </w:r>
+      <w:r>
+        <w:t xml:space="preserve">(reírse del error) ni comentarios tipo</w:t>
       </w:r>
       <w:r>
         <w:t xml:space="preserve"> </w:t>
@@ -2981,13 +5320,33 @@
         <w:t xml:space="preserve"> </w:t>
       </w:r>
       <w:r>
+        <w:rPr>
+          <w:i/>
+          <w:iCs/>
+        </w:rPr>
         <w:t xml:space="preserve">“no es para tanto”</w:t>
       </w:r>
       <w:r>
         <w:t xml:space="preserve"> </w:t>
       </w:r>
       <w:r>
-        <w:t xml:space="preserve">con respeto cambia el guion del grupo sin abrir otra pelea.</w:t>
+        <w:t xml:space="preserve">con respeto</w:t>
+      </w:r>
+      <w:r>
+        <w:t xml:space="preserve"> </w:t>
+      </w:r>
+      <w:r>
+        <w:rPr>
+          <w:b/>
+          <w:bCs/>
+        </w:rPr>
+        <w:t xml:space="preserve">cambia el guion del grupo</w:t>
+      </w:r>
+      <w:r>
+        <w:t xml:space="preserve"> </w:t>
+      </w:r>
+      <w:r>
+        <w:t xml:space="preserve">sin abrir otra pelea.</w:t>
       </w:r>
     </w:p>
     <w:p>
@@ -2997,19 +5356,53 @@
         </w:pict>
       </w:r>
     </w:p>
-    <w:bookmarkEnd w:id="35"/>
-    <w:bookmarkStart w:id="36" w:name="Xe20cc7b64780574a57eebbf307a087e3e4195bd"/>
+    <w:bookmarkEnd w:id="42"/>
+    <w:bookmarkStart w:id="43" w:name="X0bca32aacbbfef044e67ef59dd071a1d4c0346d"/>
     <w:p>
       <w:pPr>
         <w:pStyle w:val="Heading2"/>
       </w:pPr>
       <w:r>
-        <w:t xml:space="preserve">🤝 Trabajo en equipo: Misión invisible de la semana</w:t>
+        <w:t xml:space="preserve">🎁 La dinámica estrella: Misión invisible de la semana</w:t>
       </w:r>
     </w:p>
     <w:p>
       <w:pPr>
         <w:pStyle w:val="FirstParagraph"/>
+      </w:pPr>
+      <w:r>
+        <w:t xml:space="preserve">Practicar los gestos de compañerismo</w:t>
+      </w:r>
+      <w:r>
+        <w:t xml:space="preserve"> </w:t>
+      </w:r>
+      <w:r>
+        <w:rPr>
+          <w:b/>
+          <w:bCs/>
+        </w:rPr>
+        <w:t xml:space="preserve">sin protagonismos ni vergüenzas</w:t>
+      </w:r>
+      <w:r>
+        <w:t xml:space="preserve">:</w:t>
+      </w:r>
+    </w:p>
+    <w:p>
+      <w:pPr>
+        <w:pStyle w:val="BodyText"/>
+      </w:pPr>
+    </w:p>
+    <w:p>
+      <w:pPr>
+        <w:pStyle w:val="BodyText"/>
+      </w:pPr>
+      <w:r>
+        <w:t xml:space="preserve">🫥 La misión invisible — 4 pasos y una semana entera</w:t>
+      </w:r>
+    </w:p>
+    <w:p>
+      <w:pPr>
+        <w:pStyle w:val="BodyText"/>
       </w:pPr>
       <w:r>
         <w:rPr>
@@ -3066,7 +5459,23 @@
         </w:numPr>
       </w:pPr>
       <w:r>
-        <w:t xml:space="preserve">Cada persona saca en papelito el nombre de un compañero (sin repetir: quien ya tiene nombre asignado, se queda sin turnos; se puede repetir si el grupo es pequeño, avisando).</w:t>
+        <w:t xml:space="preserve">🎲 Cada persona saca en papelito</w:t>
+      </w:r>
+      <w:r>
+        <w:t xml:space="preserve"> </w:t>
+      </w:r>
+      <w:r>
+        <w:rPr>
+          <w:b/>
+          <w:bCs/>
+        </w:rPr>
+        <w:t xml:space="preserve">el nombre de un compañero</w:t>
+      </w:r>
+      <w:r>
+        <w:t xml:space="preserve"> </w:t>
+      </w:r>
+      <w:r>
+        <w:t xml:space="preserve">(sin repetir: quien ya tiene nombre asignado, se queda sin turnos; se puede repetir si el grupo es pequeño, avisando).</w:t>
       </w:r>
     </w:p>
     <w:p>
@@ -3078,7 +5487,7 @@
         </w:numPr>
       </w:pPr>
       <w:r>
-        <w:t xml:space="preserve">Esa persona recibe una</w:t>
+        <w:t xml:space="preserve">🤫 Esa persona recibe una</w:t>
       </w:r>
       <w:r>
         <w:t xml:space="preserve"> </w:t>
@@ -3129,7 +5538,7 @@
         </w:numPr>
       </w:pPr>
       <w:r>
-        <w:t xml:space="preserve">El viernes, círculo final: cada uno cuenta qué gestos recibió, y el grupo intenta adivinar quién fue su invisible.</w:t>
+        <w:t xml:space="preserve">🗓️ Toda la semana: los 3 gestos se cumplen sin que nadie lo sepa.</w:t>
       </w:r>
     </w:p>
     <w:p>
@@ -3141,7 +5550,32 @@
         </w:numPr>
       </w:pPr>
       <w:r>
-        <w:t xml:space="preserve">Cierre: recuento en la pizarra de cuántos gestos ha hecho la clase entera en una semana.</w:t>
+        <w:t xml:space="preserve">🧩 El viernes, círculo final: cada uno cuenta qué gestos recibió, y el grupo intenta</w:t>
+      </w:r>
+      <w:r>
+        <w:t xml:space="preserve"> </w:t>
+      </w:r>
+      <w:r>
+        <w:rPr>
+          <w:b/>
+          <w:bCs/>
+        </w:rPr>
+        <w:t xml:space="preserve">adivinar quién fue su invisible</w:t>
+      </w:r>
+      <w:r>
+        <w:t xml:space="preserve">.</w:t>
+      </w:r>
+    </w:p>
+    <w:p>
+      <w:pPr>
+        <w:pStyle w:val="Compact"/>
+        <w:numPr>
+          <w:ilvl w:val="0"/>
+          <w:numId w:val="1013"/>
+        </w:numPr>
+      </w:pPr>
+      <w:r>
+        <w:t xml:space="preserve">🏁 Cierre: recuento en la pizarra de cuántos gestos ha hecho la clase entera en una semana.</w:t>
       </w:r>
     </w:p>
     <w:p>
@@ -3149,6 +5583,53 @@
         <w:pStyle w:val="BlockText"/>
       </w:pPr>
       <w:r>
+        <w:t xml:space="preserve">📌</w:t>
+      </w:r>
+      <w:r>
+        <w:t xml:space="preserve"> </w:t>
+      </w:r>
+      <w:r>
+        <w:rPr>
+          <w:b/>
+          <w:bCs/>
+        </w:rPr>
+        <w:t xml:space="preserve">Por qué funciona:</w:t>
+      </w:r>
+      <w:r>
+        <w:t xml:space="preserve"> </w:t>
+      </w:r>
+      <w:r>
+        <w:t xml:space="preserve">el anónimo quita la vergüenza de</w:t>
+      </w:r>
+      <w:r>
+        <w:t xml:space="preserve"> </w:t>
+      </w:r>
+      <w:r>
+        <w:t xml:space="preserve">“quedar bien”</w:t>
+      </w:r>
+      <w:r>
+        <w:t xml:space="preserve"> </w:t>
+      </w:r>
+      <w:r>
+        <w:t xml:space="preserve">y el reto semanal convierte el compañerismo en juego. Y el adivinar invisible el viernes es la fiesta: descubres que</w:t>
+      </w:r>
+      <w:r>
+        <w:t xml:space="preserve"> </w:t>
+      </w:r>
+      <w:r>
+        <w:rPr>
+          <w:b/>
+          <w:bCs/>
+        </w:rPr>
+        <w:t xml:space="preserve">alguien te estaba mirando bien toda la semana</w:t>
+      </w:r>
+      <w:r>
+        <w:t xml:space="preserve">.</w:t>
+      </w:r>
+      <w:r>
+        <w:t xml:space="preserve"> </w:t>
+      </w:r>
+      <w:r>
         <w:t xml:space="preserve">♿</w:t>
       </w:r>
       <w:r>
@@ -3181,7 +5662,23 @@
         <w:t xml:space="preserve"> </w:t>
       </w:r>
       <w:r>
-        <w:t xml:space="preserve">y para que nadie reciba a la misma persona de siempre. Si el grupo tiene conflictos vivos, se emparejan a quienes no se hablan: la misión es un puente obligado, corto y sin riesgo (los gestos son públicos y amables, no íntimos).</w:t>
+        <w:t xml:space="preserve">y para que nadie reciba a la misma persona de siempre. Si el grupo tiene conflictos vivos, se emparejan a quienes no se hablan: la misión es un</w:t>
+      </w:r>
+      <w:r>
+        <w:t xml:space="preserve"> </w:t>
+      </w:r>
+      <w:r>
+        <w:rPr>
+          <w:b/>
+          <w:bCs/>
+        </w:rPr>
+        <w:t xml:space="preserve">puente obligado, corto y sin riesgo</w:t>
+      </w:r>
+      <w:r>
+        <w:t xml:space="preserve"> </w:t>
+      </w:r>
+      <w:r>
+        <w:t xml:space="preserve">(los gestos son públicos y amables, no íntimos).</w:t>
       </w:r>
     </w:p>
     <w:p>
@@ -3191,8 +5688,599 @@
         </w:pict>
       </w:r>
     </w:p>
-    <w:bookmarkEnd w:id="36"/>
-    <w:bookmarkStart w:id="37" w:name="logros-de-la-unidad"/>
+    <w:p>
+      <w:pPr>
+        <w:pStyle w:val="FirstParagraph"/>
+      </w:pPr>
+      <w:r>
+        <w:t xml:space="preserve">👤 Nombre:</w:t>
+      </w:r>
+      <w:r>
+        <w:t xml:space="preserve"> </w:t>
+      </w:r>
+      <w:r>
+        <w:t xml:space="preserve">📅 Fecha:</w:t>
+      </w:r>
+      <w:r>
+        <w:t xml:space="preserve"> </w:t>
+      </w:r>
+      <w:r>
+        <w:t xml:space="preserve">🏫 Grupo:</w:t>
+      </w:r>
+    </w:p>
+    <w:bookmarkEnd w:id="43"/>
+    <w:bookmarkStart w:id="44" w:name="a-por-ellos-2"/>
+    <w:p>
+      <w:pPr>
+        <w:pStyle w:val="Heading2"/>
+      </w:pPr>
+      <w:r>
+        <w:t xml:space="preserve">✍️ A por ellos</w:t>
+      </w:r>
+    </w:p>
+    <w:p>
+      <w:pPr>
+        <w:pStyle w:val="FirstParagraph"/>
+      </w:pPr>
+      <w:r>
+        <w:rPr>
+          <w:b/>
+          <w:bCs/>
+        </w:rPr>
+        <w:t xml:space="preserve">1. ✏️ Tu misión:</w:t>
+      </w:r>
+      <w:r>
+        <w:t xml:space="preserve"> </w:t>
+      </w:r>
+      <w:r>
+        <w:t xml:space="preserve">escribe aquí</w:t>
+      </w:r>
+      <w:r>
+        <w:t xml:space="preserve"> </w:t>
+      </w:r>
+      <w:r>
+        <w:rPr>
+          <w:b/>
+          <w:bCs/>
+        </w:rPr>
+        <w:t xml:space="preserve">los 3 gestos</w:t>
+      </w:r>
+      <w:r>
+        <w:t xml:space="preserve"> </w:t>
+      </w:r>
+      <w:r>
+        <w:t xml:space="preserve">que vas a cumplir esta semana hacia tu invisible (saludar, preguntar, felicitar, ayudar…):</w:t>
+      </w:r>
+    </w:p>
+    <w:p>
+      <w:pPr>
+        <w:pStyle w:val="BlockText"/>
+      </w:pPr>
+      <w:r>
+        <w:t xml:space="preserve">Gesto 1:</w:t>
+      </w:r>
+      <w:r>
+        <w:t xml:space="preserve"> </w:t>
+      </w:r>
+      <w:r>
+        <w:t xml:space="preserve"> </w:t>
+      </w:r>
+      <w:r>
+        <w:t xml:space="preserve">Gesto 2:</w:t>
+      </w:r>
+      <w:r>
+        <w:t xml:space="preserve"> </w:t>
+      </w:r>
+      <w:r>
+        <w:t xml:space="preserve"> </w:t>
+      </w:r>
+      <w:r>
+        <w:t xml:space="preserve">Gesto 3:</w:t>
+      </w:r>
+      <w:r>
+        <w:t xml:space="preserve"> </w:t>
+      </w:r>
+    </w:p>
+    <w:p>
+      <w:pPr>
+        <w:pStyle w:val="FirstParagraph"/>
+      </w:pPr>
+      <w:r>
+        <w:rPr>
+          <w:b/>
+          <w:bCs/>
+        </w:rPr>
+        <w:t xml:space="preserve">2. 🗣️ El primer paso:</w:t>
+      </w:r>
+      <w:r>
+        <w:t xml:space="preserve"> </w:t>
+      </w:r>
+      <w:r>
+        <w:t xml:space="preserve">alguien lleva dos semanas sin que nadie le hable. Escribe</w:t>
+      </w:r>
+      <w:r>
+        <w:t xml:space="preserve"> </w:t>
+      </w:r>
+      <w:r>
+        <w:rPr>
+          <w:b/>
+          <w:bCs/>
+        </w:rPr>
+        <w:t xml:space="preserve">tu frase exacta</w:t>
+      </w:r>
+      <w:r>
+        <w:t xml:space="preserve"> </w:t>
+      </w:r>
+      <w:r>
+        <w:t xml:space="preserve">(dos segundos, sin discurso):</w:t>
+      </w:r>
+    </w:p>
+    <w:p>
+      <w:pPr>
+        <w:pStyle w:val="BlockText"/>
+      </w:pPr>
+    </w:p>
+    <w:p>
+      <w:pPr>
+        <w:pStyle w:val="FirstParagraph"/>
+      </w:pPr>
+      <w:r>
+        <w:rPr>
+          <w:b/>
+          <w:bCs/>
+        </w:rPr>
+        <w:t xml:space="preserve">3. ⚔️ Incluir vs mirar:</w:t>
+      </w:r>
+      <w:r>
+        <w:t xml:space="preserve"> </w:t>
+      </w:r>
+      <w:r>
+        <w:t xml:space="preserve">en cada caso, marca</w:t>
+      </w:r>
+      <w:r>
+        <w:t xml:space="preserve"> </w:t>
+      </w:r>
+      <w:r>
+        <w:rPr>
+          <w:b/>
+          <w:bCs/>
+        </w:rPr>
+        <w:t xml:space="preserve">I</w:t>
+      </w:r>
+      <w:r>
+        <w:t xml:space="preserve"> </w:t>
+      </w:r>
+      <w:r>
+        <w:t xml:space="preserve">(incluir) o</w:t>
+      </w:r>
+      <w:r>
+        <w:t xml:space="preserve"> </w:t>
+      </w:r>
+      <w:r>
+        <w:rPr>
+          <w:b/>
+          <w:bCs/>
+        </w:rPr>
+        <w:t xml:space="preserve">M</w:t>
+      </w:r>
+      <w:r>
+        <w:t xml:space="preserve"> </w:t>
+      </w:r>
+      <w:r>
+        <w:t xml:space="preserve">(mirar):</w:t>
+      </w:r>
+    </w:p>
+    <w:tbl>
+      <w:tblPr>
+        <w:tblStyle w:val="Table"/>
+        <w:tblW w:type="auto" w:w="0"/>
+        <w:tblLook w:firstRow="1" w:lastRow="0" w:firstColumn="0" w:lastColumn="0" w:noHBand="0" w:noVBand="0" w:val="0020"/>
+      </w:tblPr>
+      <w:tblGrid>
+        <w:gridCol w:w="3960"/>
+        <w:gridCol w:w="3960"/>
+      </w:tblGrid>
+      <w:tr>
+        <w:trPr>
+          <w:tblHeader w:val="on"/>
+        </w:trPr>
+        <w:tc>
+          <w:tcPr/>
+          <w:p>
+            <w:pPr>
+              <w:pStyle w:val="Compact"/>
+            </w:pPr>
+            <w:r>
+              <w:t xml:space="preserve">Caso</w:t>
+            </w:r>
+          </w:p>
+        </w:tc>
+        <w:tc>
+          <w:tcPr/>
+          <w:p>
+            <w:pPr>
+              <w:pStyle w:val="Compact"/>
+            </w:pPr>
+            <w:r>
+              <w:t xml:space="preserve">I/M</w:t>
+            </w:r>
+          </w:p>
+        </w:tc>
+      </w:tr>
+      <w:tr>
+        <w:tc>
+          <w:tcPr/>
+          <w:p>
+            <w:pPr>
+              <w:pStyle w:val="Compact"/>
+            </w:pPr>
+            <w:r>
+              <w:t xml:space="preserve">“Venid, aquí hay sitio”</w:t>
+            </w:r>
+            <w:r>
+              <w:t xml:space="preserve"> </w:t>
+            </w:r>
+            <w:r>
+              <w:t xml:space="preserve">al nuevo</w:t>
+            </w:r>
+          </w:p>
+        </w:tc>
+        <w:tc>
+          <w:tcPr/>
+          <w:p>
+            <w:pPr>
+              <w:pStyle w:val="Compact"/>
+            </w:pPr>
+          </w:p>
+        </w:tc>
+      </w:tr>
+      <w:tr>
+        <w:tc>
+          <w:tcPr/>
+          <w:p>
+            <w:pPr>
+              <w:pStyle w:val="Compact"/>
+            </w:pPr>
+            <w:r>
+              <w:t xml:space="preserve">“No es asunto mío”</w:t>
+            </w:r>
+          </w:p>
+        </w:tc>
+        <w:tc>
+          <w:tcPr/>
+          <w:p>
+            <w:pPr>
+              <w:pStyle w:val="Compact"/>
+            </w:pPr>
+          </w:p>
+        </w:tc>
+      </w:tr>
+      <w:tr>
+        <w:tc>
+          <w:tcPr/>
+          <w:p>
+            <w:pPr>
+              <w:pStyle w:val="Compact"/>
+            </w:pPr>
+            <w:r>
+              <w:t xml:space="preserve">Avisar al que falta del plan</w:t>
+            </w:r>
+          </w:p>
+        </w:tc>
+        <w:tc>
+          <w:tcPr/>
+          <w:p>
+            <w:pPr>
+              <w:pStyle w:val="Compact"/>
+            </w:pPr>
+          </w:p>
+        </w:tc>
+      </w:tr>
+      <w:tr>
+        <w:tc>
+          <w:tcPr/>
+          <w:p>
+            <w:pPr>
+              <w:pStyle w:val="Compact"/>
+            </w:pPr>
+            <w:r>
+              <w:t xml:space="preserve">Reírse del error y seguir</w:t>
+            </w:r>
+          </w:p>
+        </w:tc>
+        <w:tc>
+          <w:tcPr/>
+          <w:p>
+            <w:pPr>
+              <w:pStyle w:val="Compact"/>
+            </w:pPr>
+          </w:p>
+        </w:tc>
+      </w:tr>
+    </w:tbl>
+    <w:p>
+      <w:pPr>
+        <w:pStyle w:val="BodyText"/>
+      </w:pPr>
+      <w:r>
+        <w:rPr>
+          <w:b/>
+          <w:bCs/>
+        </w:rPr>
+        <w:t xml:space="preserve">4. 🧩 Predicción del viernes:</w:t>
+      </w:r>
+      <w:r>
+        <w:t xml:space="preserve"> </w:t>
+      </w:r>
+      <w:r>
+        <w:t xml:space="preserve">qué gestos crees que va a recibir tu invisible de ti (los tuyos) y por qué te va a costar cumplirlos:</w:t>
+      </w:r>
+    </w:p>
+    <w:p>
+      <w:pPr>
+        <w:pStyle w:val="BlockText"/>
+      </w:pPr>
+      <w:r>
+        <w:t xml:space="preserve">Los tres:</w:t>
+      </w:r>
+      <w:r>
+        <w:t xml:space="preserve"> </w:t>
+      </w:r>
+      <w:r>
+        <w:t xml:space="preserve"> </w:t>
+      </w:r>
+      <w:r>
+        <w:t xml:space="preserve">Lo más difícil:</w:t>
+      </w:r>
+      <w:r>
+        <w:t xml:space="preserve"> </w:t>
+      </w:r>
+    </w:p>
+    <w:p>
+      <w:pPr>
+        <w:pStyle w:val="FirstParagraph"/>
+      </w:pPr>
+      <w:r>
+        <w:rPr>
+          <w:b/>
+          <w:bCs/>
+        </w:rPr>
+        <w:t xml:space="preserve">5. 🏁 El recuento:</w:t>
+      </w:r>
+      <w:r>
+        <w:t xml:space="preserve"> </w:t>
+      </w:r>
+      <w:r>
+        <w:t xml:space="preserve">si la clase tiene 24 personas y cada una cumple 3 gestos, ¿cuántos gestos ha hecho la clase en la semana?</w:t>
+      </w:r>
+    </w:p>
+    <w:p>
+      <w:pPr>
+        <w:pStyle w:val="BlockText"/>
+      </w:pPr>
+      <w:r>
+        <w:t xml:space="preserve">Respuesta: ______ gestos. ¿Qué se nota el lunes?</w:t>
+      </w:r>
+      <w:r>
+        <w:t xml:space="preserve"> </w:t>
+      </w:r>
+    </w:p>
+    <w:p>
+      <w:r>
+        <w:pict>
+          <v:rect style="width:0;height:1.5pt" o:hralign="center" o:hrstd="t" o:hr="t"/>
+        </w:pict>
+      </w:r>
+    </w:p>
+    <w:bookmarkEnd w:id="44"/>
+    <w:bookmarkStart w:id="45" w:name="mini-dinámica-el-empate-del-recreo-5-min"/>
+    <w:p>
+      <w:pPr>
+        <w:pStyle w:val="Heading2"/>
+      </w:pPr>
+      <w:r>
+        <w:t xml:space="preserve">🎭 Mini dinámica: El empate del recreo 👥 5 min</w:t>
+      </w:r>
+    </w:p>
+    <w:p>
+      <w:pPr>
+        <w:pStyle w:val="FirstParagraph"/>
+      </w:pPr>
+      <w:r>
+        <w:t xml:space="preserve">En círculo. La docencia cuenta la escena:</w:t>
+      </w:r>
+      <w:r>
+        <w:t xml:space="preserve"> </w:t>
+      </w:r>
+      <w:r>
+        <w:rPr>
+          <w:i/>
+          <w:iCs/>
+        </w:rPr>
+        <w:t xml:space="preserve">“Llega el recreo y hay quien come solo”</w:t>
+      </w:r>
+      <w:r>
+        <w:t xml:space="preserve">. En 30 segundos, cada uno escribe en un post-it</w:t>
+      </w:r>
+      <w:r>
+        <w:t xml:space="preserve"> </w:t>
+      </w:r>
+      <w:r>
+        <w:rPr>
+          <w:b/>
+          <w:bCs/>
+        </w:rPr>
+        <w:t xml:space="preserve">su primer paso</w:t>
+      </w:r>
+      <w:r>
+        <w:t xml:space="preserve"> </w:t>
+      </w:r>
+      <w:r>
+        <w:t xml:space="preserve">(frase exacta). Se leen en voz alta y se vota el más natural — ese es el que usará la clase esta semana.</w:t>
+      </w:r>
+    </w:p>
+    <w:p>
+      <w:pPr>
+        <w:pStyle w:val="BlockText"/>
+      </w:pPr>
+      <w:r>
+        <w:t xml:space="preserve">♿</w:t>
+      </w:r>
+      <w:r>
+        <w:t xml:space="preserve"> </w:t>
+      </w:r>
+      <w:r>
+        <w:rPr>
+          <w:b/>
+          <w:bCs/>
+        </w:rPr>
+        <w:t xml:space="preserve">Inclusión:</w:t>
+      </w:r>
+      <w:r>
+        <w:t xml:space="preserve"> </w:t>
+      </w:r>
+      <w:r>
+        <w:t xml:space="preserve">los post-its se leen sin firmar; quien no quiera leerlo en voz alta, lo dobla y lo deposita en la caja. Nadie queda obligado a hablar.</w:t>
+      </w:r>
+    </w:p>
+    <w:p>
+      <w:r>
+        <w:pict>
+          <v:rect style="width:0;height:1.5pt" o:hralign="center" o:hrstd="t" o:hr="t"/>
+        </w:pict>
+      </w:r>
+    </w:p>
+    <w:bookmarkEnd w:id="45"/>
+    <w:bookmarkStart w:id="46" w:name="soluciones-y-pistas-2"/>
+    <w:p>
+      <w:pPr>
+        <w:pStyle w:val="Heading2"/>
+      </w:pPr>
+      <w:r>
+        <w:t xml:space="preserve">🔑 Soluciones y pistas</w:t>
+      </w:r>
+    </w:p>
+    <w:p>
+      <w:pPr>
+        <w:pStyle w:val="FirstParagraph"/>
+      </w:pPr>
+      <w:r>
+        <w:t xml:space="preserve">🔄 Ver soluciones</w:t>
+      </w:r>
+    </w:p>
+    <w:p>
+      <w:pPr>
+        <w:pStyle w:val="Compact"/>
+        <w:numPr>
+          <w:ilvl w:val="0"/>
+          <w:numId w:val="1014"/>
+        </w:numPr>
+      </w:pPr>
+      <w:r>
+        <w:t xml:space="preserve">Cada cual suyo. Pista: si tus tres gestos son</w:t>
+      </w:r>
+      <w:r>
+        <w:t xml:space="preserve"> </w:t>
+      </w:r>
+      <w:r>
+        <w:t xml:space="preserve">“pensar en él”</w:t>
+      </w:r>
+      <w:r>
+        <w:t xml:space="preserve">, no son gestos: son pensamientos. Deben verse.</w:t>
+      </w:r>
+    </w:p>
+    <w:p>
+      <w:pPr>
+        <w:pStyle w:val="Compact"/>
+        <w:numPr>
+          <w:ilvl w:val="0"/>
+          <w:numId w:val="1014"/>
+        </w:numPr>
+      </w:pPr>
+      <w:r>
+        <w:t xml:space="preserve">Ejemplo:</w:t>
+      </w:r>
+      <w:r>
+        <w:t xml:space="preserve"> </w:t>
+      </w:r>
+      <w:r>
+        <w:rPr>
+          <w:i/>
+          <w:iCs/>
+        </w:rPr>
+        <w:t xml:space="preserve">“Oye, ¿qué tal el primer día? ¿Necesitas algo?”</w:t>
+      </w:r>
+      <w:r>
+        <w:t xml:space="preserve">. Pista: dos frases máximo.</w:t>
+      </w:r>
+    </w:p>
+    <w:p>
+      <w:pPr>
+        <w:pStyle w:val="Compact"/>
+        <w:numPr>
+          <w:ilvl w:val="0"/>
+          <w:numId w:val="1014"/>
+        </w:numPr>
+      </w:pPr>
+      <w:r>
+        <w:t xml:space="preserve">I · M · I · M (aunque el último caso — reírse y seguir — es</w:t>
+      </w:r>
+      <w:r>
+        <w:t xml:space="preserve"> </w:t>
+      </w:r>
+      <w:r>
+        <w:t xml:space="preserve">“mirar”</w:t>
+      </w:r>
+      <w:r>
+        <w:t xml:space="preserve"> </w:t>
+      </w:r>
+      <w:r>
+        <w:t xml:space="preserve">con risa).</w:t>
+      </w:r>
+    </w:p>
+    <w:p>
+      <w:pPr>
+        <w:pStyle w:val="Compact"/>
+        <w:numPr>
+          <w:ilvl w:val="0"/>
+          <w:numId w:val="1014"/>
+        </w:numPr>
+      </w:pPr>
+      <w:r>
+        <w:t xml:space="preserve">Cada cual suyo. Pista: los gestos que se te ocurren fáciles son los de tu círculo de amigos; el reto es el que no.</w:t>
+      </w:r>
+    </w:p>
+    <w:p>
+      <w:pPr>
+        <w:pStyle w:val="Compact"/>
+        <w:numPr>
+          <w:ilvl w:val="0"/>
+          <w:numId w:val="1014"/>
+        </w:numPr>
+      </w:pPr>
+      <w:r>
+        <w:rPr>
+          <w:b/>
+          <w:bCs/>
+        </w:rPr>
+        <w:t xml:space="preserve">72 gestos.</w:t>
+      </w:r>
+      <w:r>
+        <w:t xml:space="preserve"> </w:t>
+      </w:r>
+      <w:r>
+        <w:t xml:space="preserve">Y el lunes se nota en que nadie come solo.</w:t>
+      </w:r>
+    </w:p>
+    <w:p>
+      <w:r>
+        <w:pict>
+          <v:rect style="width:0;height:1.5pt" o:hralign="center" o:hrstd="t" o:hr="t"/>
+        </w:pict>
+      </w:r>
+    </w:p>
+    <w:bookmarkEnd w:id="46"/>
+    <w:bookmarkStart w:id="47" w:name="logros-de-la-unidad"/>
     <w:p>
       <w:pPr>
         <w:pStyle w:val="Heading2"/>
@@ -3223,7 +6311,7 @@
               <w:pStyle w:val="Compact"/>
             </w:pPr>
             <w:r>
-              <w:t xml:space="preserve">Logro</w:t>
+              <w:t xml:space="preserve">🏆 Logro</w:t>
             </w:r>
           </w:p>
         </w:tc>
@@ -3361,8 +6449,8 @@
         </w:pict>
       </w:r>
     </w:p>
-    <w:bookmarkEnd w:id="37"/>
-    <w:bookmarkStart w:id="38" w:name="dudas-de-10-segundos"/>
+    <w:bookmarkEnd w:id="47"/>
+    <w:bookmarkStart w:id="48" w:name="dudas-de-10-segundos"/>
     <w:p>
       <w:pPr>
         <w:pStyle w:val="Heading2"/>
@@ -3432,7 +6520,17 @@
         <w:t xml:space="preserve"> </w:t>
       </w:r>
       <w:r>
-        <w:t xml:space="preserve">Mejor aún: el compañerismo no es amistad. Puedes ser amable con quien no es tu amigo. Ese es precisamente el ejercicio.</w:t>
+        <w:rPr>
+          <w:b/>
+          <w:bCs/>
+        </w:rPr>
+        <w:t xml:space="preserve">Mejor aún:</w:t>
+      </w:r>
+      <w:r>
+        <w:t xml:space="preserve"> </w:t>
+      </w:r>
+      <w:r>
+        <w:t xml:space="preserve">el compañerismo no es amistad. Puedes ser amable con quien no es tu amigo. Ese es precisamente el ejercicio.</w:t>
       </w:r>
     </w:p>
     <w:p>
@@ -3442,8 +6540,8 @@
         </w:pict>
       </w:r>
     </w:p>
-    <w:bookmarkEnd w:id="38"/>
-    <w:bookmarkStart w:id="39" w:name="poscréditos"/>
+    <w:bookmarkEnd w:id="48"/>
+    <w:bookmarkStart w:id="49" w:name="poscréditos"/>
     <w:p>
       <w:pPr>
         <w:pStyle w:val="Heading2"/>
@@ -3515,7 +6613,23 @@
         <w:t xml:space="preserve"> </w:t>
       </w:r>
       <w:r>
-        <w:t xml:space="preserve">Yo no. Yo solo te dejaba el café. Tienes que estar atento, que el compañerismo pasa desapercibido. Igual que el café, que se enfría. Venga, ¡que es viernes!</w:t>
+        <w:t xml:space="preserve">Yo no. Yo solo te dejaba el café. Tienes que estar atento, que el compañerismo pasa desapercibido. Igual que el café, que se enfría.</w:t>
+      </w:r>
+      <w:r>
+        <w:t xml:space="preserve"> </w:t>
+      </w:r>
+      <w:r>
+        <w:rPr>
+          <w:b/>
+          <w:bCs/>
+        </w:rPr>
+        <w:t xml:space="preserve">Venga, ¡que es viernes!</w:t>
+      </w:r>
+      <w:r>
+        <w:t xml:space="preserve"> </w:t>
+      </w:r>
+      <w:r>
+        <w:t xml:space="preserve">☕</w:t>
       </w:r>
     </w:p>
     <w:p>
@@ -3535,7 +6649,7 @@
       <w:r>
         <w:t xml:space="preserve"> </w:t>
       </w:r>
-      <w:hyperlink r:id="rId23">
+      <w:hyperlink r:id="rId25">
         <w:r>
           <w:rPr>
             <w:rStyle w:val="Hyperlink"/>
@@ -3593,8 +6707,8 @@
         <w:t xml:space="preserve">Líneas rojas (próximamente)</w:t>
       </w:r>
     </w:p>
-    <w:bookmarkEnd w:id="39"/>
-    <w:bookmarkEnd w:id="40"/>
+    <w:bookmarkEnd w:id="49"/>
+    <w:bookmarkEnd w:id="50"/>
     <w:sectPr>
       <w:footnotePr>
         <w:numRestart w:val="eachSect"/>
@@ -3966,34 +7080,7 @@
     </w:lvlOverride>
   </w:num>
   <w:num w:numId="1006">
-    <w:abstractNumId w:val="99411"/>
-    <w:lvlOverride w:ilvl="0">
-      <w:startOverride w:val="1"/>
-    </w:lvlOverride>
-    <w:lvlOverride w:ilvl="1">
-      <w:startOverride w:val="1"/>
-    </w:lvlOverride>
-    <w:lvlOverride w:ilvl="2">
-      <w:startOverride w:val="1"/>
-    </w:lvlOverride>
-    <w:lvlOverride w:ilvl="3">
-      <w:startOverride w:val="1"/>
-    </w:lvlOverride>
-    <w:lvlOverride w:ilvl="4">
-      <w:startOverride w:val="1"/>
-    </w:lvlOverride>
-    <w:lvlOverride w:ilvl="5">
-      <w:startOverride w:val="1"/>
-    </w:lvlOverride>
-    <w:lvlOverride w:ilvl="6">
-      <w:startOverride w:val="1"/>
-    </w:lvlOverride>
-    <w:lvlOverride w:ilvl="7">
-      <w:startOverride w:val="1"/>
-    </w:lvlOverride>
-    <w:lvlOverride w:ilvl="8">
-      <w:startOverride w:val="1"/>
-    </w:lvlOverride>
+    <w:abstractNumId w:val="991"/>
   </w:num>
   <w:num w:numId="1007">
     <w:abstractNumId w:val="991"/>
@@ -4122,6 +7209,36 @@
     </w:lvlOverride>
   </w:num>
   <w:num w:numId="1013">
+    <w:abstractNumId w:val="99411"/>
+    <w:lvlOverride w:ilvl="0">
+      <w:startOverride w:val="1"/>
+    </w:lvlOverride>
+    <w:lvlOverride w:ilvl="1">
+      <w:startOverride w:val="1"/>
+    </w:lvlOverride>
+    <w:lvlOverride w:ilvl="2">
+      <w:startOverride w:val="1"/>
+    </w:lvlOverride>
+    <w:lvlOverride w:ilvl="3">
+      <w:startOverride w:val="1"/>
+    </w:lvlOverride>
+    <w:lvlOverride w:ilvl="4">
+      <w:startOverride w:val="1"/>
+    </w:lvlOverride>
+    <w:lvlOverride w:ilvl="5">
+      <w:startOverride w:val="1"/>
+    </w:lvlOverride>
+    <w:lvlOverride w:ilvl="6">
+      <w:startOverride w:val="1"/>
+    </w:lvlOverride>
+    <w:lvlOverride w:ilvl="7">
+      <w:startOverride w:val="1"/>
+    </w:lvlOverride>
+    <w:lvlOverride w:ilvl="8">
+      <w:startOverride w:val="1"/>
+    </w:lvlOverride>
+  </w:num>
+  <w:num w:numId="1014">
     <w:abstractNumId w:val="99411"/>
     <w:lvlOverride w:ilvl="0">
       <w:startOverride w:val="1"/>

</xml_diff>